<commit_message>
chore: remove debug endpoint
</commit_message>
<xml_diff>
--- a/CareCompanion_Full_Breakdown.docx
+++ b/CareCompanion_Full_Breakdown.docx
@@ -2,13 +2,70 @@
 <file path=word/document.xml><?xml version="1.0" encoding="utf-8"?>
 <w:document xmlns:wpc="http://schemas.microsoft.com/office/word/2010/wordprocessingCanvas" xmlns:mo="http://schemas.microsoft.com/office/mac/office/2008/main" xmlns:mc="http://schemas.openxmlformats.org/markup-compatibility/2006" xmlns:mv="urn:schemas-microsoft-com:mac:vml" xmlns:o="urn:schemas-microsoft-com:office:office" xmlns:r="http://schemas.openxmlformats.org/officeDocument/2006/relationships" xmlns:m="http://schemas.openxmlformats.org/officeDocument/2006/math" xmlns:v="urn:schemas-microsoft-com:vml" xmlns:wp14="http://schemas.microsoft.com/office/word/2010/wordprocessingDrawing" xmlns:wp="http://schemas.openxmlformats.org/drawingml/2006/wordprocessingDrawing" xmlns:w10="urn:schemas-microsoft-com:office:word" xmlns:w="http://schemas.openxmlformats.org/wordprocessingml/2006/main" xmlns:w14="http://schemas.microsoft.com/office/word/2010/wordml" xmlns:wpg="http://schemas.microsoft.com/office/word/2010/wordprocessingGroup" xmlns:wpi="http://schemas.microsoft.com/office/word/2010/wordprocessingInk" xmlns:wne="http://schemas.microsoft.com/office/word/2006/wordml" xmlns:wps="http://schemas.microsoft.com/office/word/2010/wordprocessingShape" mc:Ignorable="w14 wp14">
   <w:body>
+    <w:p/>
+    <w:p/>
     <w:p>
       <w:pPr>
         <w:pStyle w:val="Title"/>
         <w:jc w:val="center"/>
       </w:pPr>
       <w:r>
-        <w:t>CareCompanion — Full Product Breakdown</w:t>
+        <w:t>CareCompanion</w:t>
+      </w:r>
+    </w:p>
+    <w:p>
+      <w:pPr>
+        <w:jc w:val="center"/>
+      </w:pPr>
+      <w:r>
+        <w:rPr>
+          <w:color w:val="A78BFA"/>
+          <w:sz w:val="36"/>
+        </w:rPr>
+        <w:t>AI-Powered Cancer Care Platform</w:t>
+      </w:r>
+    </w:p>
+    <w:p>
+      <w:pPr>
+        <w:jc w:val="center"/>
+      </w:pPr>
+      <w:r>
+        <w:rPr>
+          <w:color w:val="646464"/>
+          <w:sz w:val="28"/>
+        </w:rPr>
+        <w:t>Complete Technical &amp; Product Documentation</w:t>
+      </w:r>
+    </w:p>
+    <w:p/>
+    <w:p>
+      <w:pPr>
+        <w:jc w:val="center"/>
+      </w:pPr>
+      <w:r>
+        <w:rPr>
+          <w:sz w:val="22"/>
+        </w:rPr>
+        <w:t>Version 0.1.1.0</w:t>
+        <w:br/>
+      </w:r>
+      <w:r>
+        <w:rPr>
+          <w:sz w:val="22"/>
+        </w:rPr>
+        <w:t>April 2026</w:t>
+        <w:br/>
+      </w:r>
+      <w:r>
+        <w:rPr>
+          <w:sz w:val="22"/>
+        </w:rPr>
+        <w:t>carecompanionai.org</w:t>
+      </w:r>
+    </w:p>
+    <w:p>
+      <w:r>
+        <w:br w:type="page"/>
       </w:r>
     </w:p>
     <w:p>
@@ -16,17 +73,140 @@
         <w:pStyle w:val="Heading1"/>
       </w:pPr>
       <w:r>
-        <w:t>What Is CareCompanion?</w:t>
+        <w:t>Table of Contents</w:t>
+      </w:r>
+    </w:p>
+    <w:p>
+      <w:pPr>
+        <w:pStyle w:val="ListNumber"/>
+      </w:pPr>
+      <w:r>
+        <w:t>1. Executive Summary</w:t>
+      </w:r>
+    </w:p>
+    <w:p>
+      <w:pPr>
+        <w:pStyle w:val="ListNumber"/>
+      </w:pPr>
+      <w:r>
+        <w:t>2. Product Overview</w:t>
+      </w:r>
+    </w:p>
+    <w:p>
+      <w:pPr>
+        <w:pStyle w:val="ListNumber"/>
+      </w:pPr>
+      <w:r>
+        <w:t>3. User Experience &amp; Flows</w:t>
+      </w:r>
+    </w:p>
+    <w:p>
+      <w:pPr>
+        <w:pStyle w:val="ListNumber"/>
+      </w:pPr>
+      <w:r>
+        <w:t>4. Technology Stack</w:t>
+      </w:r>
+    </w:p>
+    <w:p>
+      <w:pPr>
+        <w:pStyle w:val="ListNumber"/>
+      </w:pPr>
+      <w:r>
+        <w:t>5. Frontend Architecture</w:t>
+      </w:r>
+    </w:p>
+    <w:p>
+      <w:pPr>
+        <w:pStyle w:val="ListNumber"/>
+      </w:pPr>
+      <w:r>
+        <w:t>6. Backend Architecture &amp; API</w:t>
+      </w:r>
+    </w:p>
+    <w:p>
+      <w:pPr>
+        <w:pStyle w:val="ListNumber"/>
+      </w:pPr>
+      <w:r>
+        <w:t>7. AI System</w:t>
+      </w:r>
+    </w:p>
+    <w:p>
+      <w:pPr>
+        <w:pStyle w:val="ListNumber"/>
+      </w:pPr>
+      <w:r>
+        <w:t>8. Database Schema</w:t>
+      </w:r>
+    </w:p>
+    <w:p>
+      <w:pPr>
+        <w:pStyle w:val="ListNumber"/>
+      </w:pPr>
+      <w:r>
+        <w:t>9. Authentication &amp; Security</w:t>
+      </w:r>
+    </w:p>
+    <w:p>
+      <w:pPr>
+        <w:pStyle w:val="ListNumber"/>
+      </w:pPr>
+      <w:r>
+        <w:t>10. Health Data Integrations</w:t>
+      </w:r>
+    </w:p>
+    <w:p>
+      <w:pPr>
+        <w:pStyle w:val="ListNumber"/>
+      </w:pPr>
+      <w:r>
+        <w:t>11. Notification Engine</w:t>
+      </w:r>
+    </w:p>
+    <w:p>
+      <w:pPr>
+        <w:pStyle w:val="ListNumber"/>
+      </w:pPr>
+      <w:r>
+        <w:t>12. Onboarding Flow</w:t>
+      </w:r>
+    </w:p>
+    <w:p>
+      <w:pPr>
+        <w:pStyle w:val="ListNumber"/>
+      </w:pPr>
+      <w:r>
+        <w:t>13. Multi-Patient Support</w:t>
+      </w:r>
+    </w:p>
+    <w:p>
+      <w:pPr>
+        <w:pStyle w:val="ListNumber"/>
+      </w:pPr>
+      <w:r>
+        <w:t>14. Deployment &amp; Infrastructure</w:t>
+      </w:r>
+    </w:p>
+    <w:p>
+      <w:pPr>
+        <w:pStyle w:val="ListNumber"/>
+      </w:pPr>
+      <w:r>
+        <w:t>15. Testing</w:t>
+      </w:r>
+    </w:p>
+    <w:p>
+      <w:pPr>
+        <w:pStyle w:val="ListNumber"/>
+      </w:pPr>
+      <w:r>
+        <w:t>16. Future Roadmap</w:t>
       </w:r>
     </w:p>
     <w:p>
       <w:r>
-        <w:t>CareCompanion is an AI-powered app built for family caregivers — people who help manage the health of a loved one (a parent, spouse, child, etc.). It acts as a single hub where all of a patient's medical information lives: medications, doctor visits, lab results, insurance details, and more. Instead of juggling paper records, patient portals, pharmacy apps, and sticky notes, a caregiver opens CareCompanion and talks to an AI assistant that knows everything about their loved one's health situation.</w:t>
-      </w:r>
-    </w:p>
-    <w:p>
-      <w:r>
-        <w:t>The app is a web application (works in a browser on phone or desktop) built with Next.js, powered by Claude AI from Anthropic, and stores all data in a Supabase database (a cloud-hosted database service).</w:t>
+        <w:br w:type="page"/>
       </w:r>
     </w:p>
     <w:p>
@@ -34,65 +214,17 @@
         <w:pStyle w:val="Heading1"/>
       </w:pPr>
       <w:r>
-        <w:t>The Core Experience: Chat</w:t>
+        <w:t>1. Executive Summary</w:t>
       </w:r>
     </w:p>
     <w:p>
       <w:r>
-        <w:t>The heart of the app is a chat interface — similar to texting. The caregiver types a question or request in plain language, and the AI responds. Examples:</w:t>
-      </w:r>
-    </w:p>
-    <w:p>
-      <w:pPr>
-        <w:pStyle w:val="ListBullet"/>
-      </w:pPr>
-      <w:r>
-        <w:t>"When is Mom's next appointment?"</w:t>
-      </w:r>
-    </w:p>
-    <w:p>
-      <w:pPr>
-        <w:pStyle w:val="ListBullet"/>
-      </w:pPr>
-      <w:r>
-        <w:t>"What medications is Dad taking and when do they need refills?"</w:t>
-      </w:r>
-    </w:p>
-    <w:p>
-      <w:pPr>
-        <w:pStyle w:val="ListBullet"/>
-      </w:pPr>
-      <w:r>
-        <w:t>"Can you explain what this lab result means?"</w:t>
-      </w:r>
-    </w:p>
-    <w:p>
-      <w:pPr>
-        <w:pStyle w:val="ListBullet"/>
-      </w:pPr>
-      <w:r>
-        <w:t>"Help me prepare questions for Thursday's cardiology visit."</w:t>
-      </w:r>
-    </w:p>
-    <w:p>
-      <w:pPr>
-        <w:pStyle w:val="ListBullet"/>
-      </w:pPr>
-      <w:r>
-        <w:t>"Save that Mom's new allergist is Dr. Patel at 555-1234."</w:t>
+        <w:t>CareCompanion is an AI-powered cancer care assistant built for family caregivers managing medications, appointments, lab results, insurance claims, and health records for their loved ones. The app combines a cancer-literate AI chatbot with comprehensive health data tracking, proactive notifications, and direct integrations with health systems like Epic MyChart, pharmacy systems like Walgreens, and insurance portals.</w:t>
       </w:r>
     </w:p>
     <w:p>
       <w:r>
-        <w:t>The AI can do more than just answer questions — it can take actions. It has 16 built-in tools that let it save medications, schedule appointments, record lab results, update insurance info, generate visit prep sheets, and more. When you tell it something important, it saves it to the database automatically.</w:t>
-      </w:r>
-    </w:p>
-    <w:p>
-      <w:pPr>
-        <w:pStyle w:val="Heading1"/>
-      </w:pPr>
-      <w:r>
-        <w:t>How the AI Works Behind the Scenes</w:t>
+        <w:t>The core value proposition is simple: a knowledgeable friend at 2am who actually understands chemo. When a caregiver wonders "is this nausea normal on day 5 of FOLFOX?" or "what questions should I ask the oncologist about rising CA-125?", CareCompanion provides specific, cancer-literate answers — not generic WebMD results.</w:t>
       </w:r>
     </w:p>
     <w:p>
@@ -100,1271 +232,13 @@
         <w:pStyle w:val="Heading2"/>
       </w:pPr>
       <w:r>
-        <w:t>The Multi-Specialist System</w:t>
-      </w:r>
-    </w:p>
-    <w:p>
-      <w:r>
-        <w:t>When a caregiver sends a message, it doesn't just go to one AI. There's a layered system:</w:t>
-      </w:r>
-    </w:p>
-    <w:p>
-      <w:r>
-        <w:t>Step 1: The Router — A fast, lightweight AI model reads the message and figures out what kind of question it is. Is it about medications? Insurance? Emotional support? Lab results? It can pick multiple categories if the question touches several topics.</w:t>
-      </w:r>
-    </w:p>
-    <w:p>
-      <w:r>
-        <w:t>Step 2: Specialist Agents — Based on the router's decision, one or more specialist agents activate. There are six:</w:t>
-      </w:r>
-    </w:p>
-    <w:p>
-      <w:pPr>
-        <w:pStyle w:val="ListBullet"/>
-      </w:pPr>
-      <w:r>
-        <w:rPr>
-          <w:b/>
-        </w:rPr>
-        <w:t xml:space="preserve">Medication Specialist — </w:t>
-      </w:r>
-      <w:r>
-        <w:t>Knows about drugs, doses, interactions, refills, pharmacy issues</w:t>
-      </w:r>
-    </w:p>
-    <w:p>
-      <w:pPr>
-        <w:pStyle w:val="ListBullet"/>
-      </w:pPr>
-      <w:r>
-        <w:rPr>
-          <w:b/>
-        </w:rPr>
-        <w:t xml:space="preserve">Insurance Navigator — </w:t>
-      </w:r>
-      <w:r>
-        <w:t>Handles claims, denials, appeals, costs, flexible spending accounts</w:t>
-      </w:r>
-    </w:p>
-    <w:p>
-      <w:pPr>
-        <w:pStyle w:val="ListBullet"/>
-      </w:pPr>
-      <w:r>
-        <w:rPr>
-          <w:b/>
-        </w:rPr>
-        <w:t xml:space="preserve">Scheduling Coordinator — </w:t>
-      </w:r>
-      <w:r>
-        <w:t>Manages appointments, visit preparation, follow-ups</w:t>
-      </w:r>
-    </w:p>
-    <w:p>
-      <w:pPr>
-        <w:pStyle w:val="ListBullet"/>
-      </w:pPr>
-      <w:r>
-        <w:rPr>
-          <w:b/>
-        </w:rPr>
-        <w:t xml:space="preserve">Wellness Monitor — </w:t>
-      </w:r>
-      <w:r>
-        <w:t>Tracks symptoms, watches for caregiver burnout, provides emotional support</w:t>
-      </w:r>
-    </w:p>
-    <w:p>
-      <w:pPr>
-        <w:pStyle w:val="ListBullet"/>
-      </w:pPr>
-      <w:r>
-        <w:rPr>
-          <w:b/>
-        </w:rPr>
-        <w:t xml:space="preserve">Lab Analyst — </w:t>
-      </w:r>
-      <w:r>
-        <w:t>Interprets lab results, spots trends, flags abnormal values</w:t>
-      </w:r>
-    </w:p>
-    <w:p>
-      <w:pPr>
-        <w:pStyle w:val="ListBullet"/>
-      </w:pPr>
-      <w:r>
-        <w:rPr>
-          <w:b/>
-        </w:rPr>
-        <w:t xml:space="preserve">General Companion — </w:t>
-      </w:r>
-      <w:r>
-        <w:t>Handles everything else: profile updates, document analysis, multi-topic questions</w:t>
-      </w:r>
-    </w:p>
-    <w:p>
-      <w:r>
-        <w:t>These specialists run at the same time (in parallel), each analyzing the question from their area of expertise with the relevant patient data.</w:t>
-      </w:r>
-    </w:p>
-    <w:p>
-      <w:r>
-        <w:t>Step 3: The Main AI — A more powerful AI model (Claude Sonnet) receives all the specialist analyses, combines them into one coherent response, and replies to the caregiver. This model also decides whether to use any tools (like saving a medication or scheduling an appointment).</w:t>
-      </w:r>
-    </w:p>
-    <w:p>
-      <w:r>
-        <w:t>The result: the caregiver gets one natural response, but it's informed by multiple expert perspectives working together.</w:t>
-      </w:r>
-    </w:p>
-    <w:p>
-      <w:pPr>
-        <w:pStyle w:val="Heading2"/>
-      </w:pPr>
-      <w:r>
-        <w:t>Long-Term Memory</w:t>
-      </w:r>
-    </w:p>
-    <w:p>
-      <w:r>
-        <w:t>The AI remembers things across conversations. After every response, a background process reads through what was discussed and pulls out important facts — a new medication, a doctor's name, an insurance detail, a personal preference. These facts get saved to a "memories" table in the database, categorized (medication, condition, allergy, insurance, provider, preference, family info, etc.).</w:t>
-      </w:r>
-    </w:p>
-    <w:p>
-      <w:r>
-        <w:t>The next time the caregiver opens a chat — even days or weeks later — the AI loads these memories into its context. It knows that Mom is allergic to penicillin, that Dad's cardiologist is Dr. Chen, that the family prefers morning appointments. This creates continuity that feels like talking to someone who actually knows your situation.</w:t>
-      </w:r>
-    </w:p>
-    <w:p>
-      <w:r>
-        <w:t>Additionally, every 20 messages, the system generates a conversation summary — a digest of what was discussed, what topics came up, and what actions were taken. These summaries help the AI recall the arc of past conversations without needing to re-read every old message.</w:t>
-      </w:r>
-    </w:p>
-    <w:p>
-      <w:pPr>
-        <w:pStyle w:val="Heading1"/>
-      </w:pPr>
-      <w:r>
-        <w:t>What the Caregiver Sees (All the Screens)</w:t>
-      </w:r>
-    </w:p>
-    <w:p>
-      <w:pPr>
-        <w:pStyle w:val="Heading2"/>
-      </w:pPr>
-      <w:r>
-        <w:t>Dashboard</w:t>
-      </w:r>
-    </w:p>
-    <w:p>
-      <w:r>
-        <w:t>The home screen. Shows a quick overview: unread notifications, upcoming appointments, medication refill status, and quick-action buttons that jump into the chat with pre-filled prompts like "Help me prepare for my next appointment."</w:t>
-      </w:r>
-    </w:p>
-    <w:p>
-      <w:pPr>
-        <w:pStyle w:val="Heading2"/>
-      </w:pPr>
-      <w:r>
-        <w:t>Chat</w:t>
-      </w:r>
-    </w:p>
-    <w:p>
-      <w:r>
-        <w:t>The main AI conversation screen. Has a text input, a voice input button (speak instead of type), and a document scanner button (photograph a medical document and the AI extracts the data). Messages appear in a familiar chat-bubble format with a typing indicator while the AI thinks.</w:t>
-      </w:r>
-    </w:p>
-    <w:p>
-      <w:pPr>
-        <w:pStyle w:val="Heading2"/>
-      </w:pPr>
-      <w:r>
-        <w:t>Medications</w:t>
-      </w:r>
-    </w:p>
-    <w:p>
-      <w:r>
-        <w:t>A list of all tracked medications with name, dose, how often they're taken, and when refills are due. Caregivers can set reminders for each medication here.</w:t>
-      </w:r>
-    </w:p>
-    <w:p>
-      <w:pPr>
-        <w:pStyle w:val="Heading2"/>
-      </w:pPr>
-      <w:r>
-        <w:t>Appointments</w:t>
-      </w:r>
-    </w:p>
-    <w:p>
-      <w:r>
-        <w:t>Shows upcoming doctor visits with date, time, doctor name, location, and purpose. From here, caregivers can generate a visit prep sheet (the AI compiles current medications, recent labs, and suggested questions) or record post-visit notes (what the doctor said, any medication changes, follow-up instructions).</w:t>
-      </w:r>
-    </w:p>
-    <w:p>
-      <w:pPr>
-        <w:pStyle w:val="Heading2"/>
-      </w:pPr>
-      <w:r>
-        <w:t>Calendar</w:t>
-      </w:r>
-    </w:p>
-    <w:p>
-      <w:r>
-        <w:t>A monthly view showing appointment dots and refill markers so caregivers can see the full picture at a glance.</w:t>
-      </w:r>
-    </w:p>
-    <w:p>
-      <w:pPr>
-        <w:pStyle w:val="Heading2"/>
-      </w:pPr>
-      <w:r>
-        <w:t>Journal (Symptom Tracking)</w:t>
-      </w:r>
-    </w:p>
-    <w:p>
-      <w:r>
-        <w:t>A daily check-in form where the caregiver records the patient's pain level, mood, sleep quality, energy, appetite, and any symptoms or notes. This data feeds into analytics and gives the AI context about how the patient is doing over time.</w:t>
-      </w:r>
-    </w:p>
-    <w:p>
-      <w:pPr>
-        <w:pStyle w:val="Heading2"/>
-      </w:pPr>
-      <w:r>
-        <w:t>Analytics</w:t>
-      </w:r>
-    </w:p>
-    <w:p>
-      <w:r>
-        <w:t>Charts and graphs showing medication adherence (how consistently reminders are being followed), symptom trends over time, and lab result trends. Helps caregivers and doctors spot patterns.</w:t>
-      </w:r>
-    </w:p>
-    <w:p>
-      <w:pPr>
-        <w:pStyle w:val="Heading2"/>
-      </w:pPr>
-      <w:r>
-        <w:t>Document Scanner</w:t>
-      </w:r>
-    </w:p>
-    <w:p>
-      <w:r>
-        <w:t>Take a photo of a medical document (lab report, insurance card, prescription, etc.) and the AI uses vision capabilities to read and extract structured data from it. It can then offer to import that data into the appropriate place — lab results into the labs section, medication info into the medications list, etc. Maximum file size is 10 megabytes.</w:t>
-      </w:r>
-    </w:p>
-    <w:p>
-      <w:pPr>
-        <w:pStyle w:val="Heading2"/>
-      </w:pPr>
-      <w:r>
-        <w:t>Care Team</w:t>
-      </w:r>
-    </w:p>
-    <w:p>
-      <w:r>
-        <w:t>Invite other family members by email to share access to a patient's profile. There are three permission levels:</w:t>
-        <w:br/>
-        <w:t>• Owner — Full control, can add/remove team members</w:t>
-        <w:br/>
-        <w:t>• Editor — Can view and update all data, manage invitations</w:t>
-        <w:br/>
-        <w:t>• Viewer — Read-only access</w:t>
-        <w:br/>
-        <w:t>There's an activity feed showing who did what. Invitations expire after 7 days.</w:t>
-      </w:r>
-    </w:p>
-    <w:p>
-      <w:pPr>
-        <w:pStyle w:val="Heading2"/>
-      </w:pPr>
-      <w:r>
-        <w:t>Emergency Card</w:t>
-      </w:r>
-    </w:p>
-    <w:p>
-      <w:r>
-        <w:t>A one-tap screen showing critical information a paramedic would need: patient name, age, allergies, current medications, emergency contacts. Designed to be shown quickly on a phone screen in an emergency.</w:t>
-      </w:r>
-    </w:p>
-    <w:p>
-      <w:pPr>
-        <w:pStyle w:val="Heading2"/>
-      </w:pPr>
-      <w:r>
-        <w:t>Health Summary</w:t>
-      </w:r>
-    </w:p>
-    <w:p>
-      <w:r>
-        <w:t>A comprehensive, printable document combining all of a patient's health data — medications, conditions, allergies, doctors, recent labs, insurance info. Can be shared with a new doctor or brought to a hospital visit.</w:t>
-      </w:r>
-    </w:p>
-    <w:p>
-      <w:pPr>
-        <w:pStyle w:val="Heading2"/>
-      </w:pPr>
-      <w:r>
-        <w:t>Settings</w:t>
-      </w:r>
-    </w:p>
-    <w:p>
-      <w:r>
-        <w:t>Toggle notification preferences (refill reminders, appointment reminders, lab alerts, claim updates), manage connected integrations, and handle account actions (export all data, delete account).</w:t>
-      </w:r>
-    </w:p>
-    <w:p>
-      <w:pPr>
-        <w:pStyle w:val="Heading2"/>
-      </w:pPr>
-      <w:r>
-        <w:t>Profile &amp; Multi-Patient Support</w:t>
-      </w:r>
-    </w:p>
-    <w:p>
-      <w:r>
-        <w:t>Each caregiver can manage multiple patients. There's a profile switcher in the header — tap it to switch between patients. Each patient has their own separate set of medications, appointments, doctors, labs, and everything else. The AI adjusts its context based on which patient is currently active.</w:t>
-      </w:r>
-    </w:p>
-    <w:p>
-      <w:pPr>
-        <w:pStyle w:val="Heading2"/>
-      </w:pPr>
-      <w:r>
-        <w:t>Connect (Integrations)</w:t>
-      </w:r>
-    </w:p>
-    <w:p>
-      <w:r>
-        <w:t>A page where caregivers can link external health systems. Hospital systems (via 1upHealth or Epic directly) pull in medications, conditions, allergies, lab results, appointments, doctors, and insurance claims automatically from the hospital's electronic health records. Supported systems include Epic, Sutter, Kaiser, Stanford, UCSF, and others. Google Calendar sync and Walgreens pharmacy integration are also planned.</w:t>
-      </w:r>
-    </w:p>
-    <w:p>
-      <w:pPr>
-        <w:pStyle w:val="Heading1"/>
-      </w:pPr>
-      <w:r>
-        <w:t>Health System Integration (Importing Medical Records)</w:t>
-      </w:r>
-    </w:p>
-    <w:p>
-      <w:r>
-        <w:t>CareCompanion can connect directly to hospital electronic health record systems using a universal standard called FHIR (a common format for health data exchange). The process works like this:</w:t>
-      </w:r>
-    </w:p>
-    <w:p>
-      <w:r>
-        <w:t>1. The caregiver clicks "Connect Health System" in the app.</w:t>
-      </w:r>
-    </w:p>
-    <w:p>
-      <w:r>
-        <w:t>2. They're redirected to their hospital's login page (e.g., MyChart for Epic hospitals).</w:t>
-      </w:r>
-    </w:p>
-    <w:p>
-      <w:r>
-        <w:t>3. They log in and grant CareCompanion permission to read their records.</w:t>
-      </w:r>
-    </w:p>
-    <w:p>
-      <w:r>
-        <w:t>4. The app receives an access token and pulls in all available data.</w:t>
-      </w:r>
-    </w:p>
-    <w:p>
-      <w:r>
-        <w:t>Data that gets imported:</w:t>
-      </w:r>
-    </w:p>
-    <w:p>
-      <w:pPr>
-        <w:pStyle w:val="ListBullet"/>
-      </w:pPr>
-      <w:r>
-        <w:t>Medications (current prescriptions)</w:t>
-      </w:r>
-    </w:p>
-    <w:p>
-      <w:pPr>
-        <w:pStyle w:val="ListBullet"/>
-      </w:pPr>
-      <w:r>
-        <w:t>Conditions (diagnoses)</w:t>
-      </w:r>
-    </w:p>
-    <w:p>
-      <w:pPr>
-        <w:pStyle w:val="ListBullet"/>
-      </w:pPr>
-      <w:r>
-        <w:t>Allergies</w:t>
-      </w:r>
-    </w:p>
-    <w:p>
-      <w:pPr>
-        <w:pStyle w:val="ListBullet"/>
-      </w:pPr>
-      <w:r>
-        <w:t>Lab results (with normal ranges and abnormal flags)</w:t>
-      </w:r>
-    </w:p>
-    <w:p>
-      <w:pPr>
-        <w:pStyle w:val="ListBullet"/>
-      </w:pPr>
-      <w:r>
-        <w:t>Appointments (past and upcoming)</w:t>
-      </w:r>
-    </w:p>
-    <w:p>
-      <w:pPr>
-        <w:pStyle w:val="ListBullet"/>
-      </w:pPr>
-      <w:r>
-        <w:t>Doctors and specialists</w:t>
-      </w:r>
-    </w:p>
-    <w:p>
-      <w:pPr>
-        <w:pStyle w:val="ListBullet"/>
-      </w:pPr>
-      <w:r>
-        <w:t>Insurance claims</w:t>
-      </w:r>
-    </w:p>
-    <w:p>
-      <w:pPr>
-        <w:pStyle w:val="ListBullet"/>
-      </w:pPr>
-      <w:r>
-        <w:t>Insurance coverage details</w:t>
-      </w:r>
-    </w:p>
-    <w:p>
-      <w:r>
-        <w:t>All imported data is automatically organized into the correct sections of the app. Currently, syncing new data from the hospital requires a manual trigger; automatic scheduled syncing is planned.</w:t>
-      </w:r>
-    </w:p>
-    <w:p>
-      <w:pPr>
-        <w:pStyle w:val="Heading1"/>
-      </w:pPr>
-      <w:r>
-        <w:t>Proactive Notifications</w:t>
-      </w:r>
-    </w:p>
-    <w:p>
-      <w:r>
-        <w:t>The app doesn't just wait for the caregiver to ask questions — it actively watches for things that need attention. A background job runs every 15 minutes and checks for:</w:t>
-      </w:r>
-    </w:p>
-    <w:p>
-      <w:pPr>
-        <w:pStyle w:val="ListBullet"/>
-      </w:pPr>
-      <w:r>
-        <w:rPr>
-          <w:b/>
-        </w:rPr>
-        <w:t xml:space="preserve">Medication refills due soon — </w:t>
-      </w:r>
-      <w:r>
-        <w:t>If a refill date is within 3 days or overdue, it sends an alert</w:t>
-      </w:r>
-    </w:p>
-    <w:p>
-      <w:pPr>
-        <w:pStyle w:val="ListBullet"/>
-      </w:pPr>
-      <w:r>
-        <w:rPr>
-          <w:b/>
-        </w:rPr>
-        <w:t xml:space="preserve">Appointments tomorrow — </w:t>
-      </w:r>
-      <w:r>
-        <w:t>Reminder the day before with time and location</w:t>
-      </w:r>
-    </w:p>
-    <w:p>
-      <w:pPr>
-        <w:pStyle w:val="ListBullet"/>
-      </w:pPr>
-      <w:r>
-        <w:rPr>
-          <w:b/>
-        </w:rPr>
-        <w:t xml:space="preserve">Appointments today — </w:t>
-      </w:r>
-      <w:r>
-        <w:t>Same-day reminder</w:t>
-      </w:r>
-    </w:p>
-    <w:p>
-      <w:pPr>
-        <w:pStyle w:val="ListBullet"/>
-      </w:pPr>
-      <w:r>
-        <w:rPr>
-          <w:b/>
-        </w:rPr>
-        <w:t xml:space="preserve">Abnormal lab results — </w:t>
-      </w:r>
-      <w:r>
-        <w:t>If a new lab value is flagged as outside the normal range</w:t>
-      </w:r>
-    </w:p>
-    <w:p>
-      <w:pPr>
-        <w:pStyle w:val="ListBullet"/>
-      </w:pPr>
-      <w:r>
-        <w:rPr>
-          <w:b/>
-        </w:rPr>
-        <w:t xml:space="preserve">Expiring prior authorizations — </w:t>
-      </w:r>
-      <w:r>
-        <w:t>If an insurance pre-approval is expiring within 14 days</w:t>
-      </w:r>
-    </w:p>
-    <w:p>
-      <w:pPr>
-        <w:pStyle w:val="ListBullet"/>
-      </w:pPr>
-      <w:r>
-        <w:rPr>
-          <w:b/>
-        </w:rPr>
-        <w:t xml:space="preserve">Low flexible spending / health savings account balance — </w:t>
-      </w:r>
-      <w:r>
-        <w:t>If the balance drops below 10% of the limit</w:t>
-      </w:r>
-    </w:p>
-    <w:p>
-      <w:r>
-        <w:t>The system is smart about not sending duplicates — it checks if the same alert was already sent in the last 24 hours. It also respects the user's notification preferences.</w:t>
-      </w:r>
-    </w:p>
-    <w:p>
-      <w:pPr>
-        <w:pStyle w:val="Heading1"/>
-      </w:pPr>
-      <w:r>
-        <w:t>Medication Reminders</w:t>
-      </w:r>
-    </w:p>
-    <w:p>
-      <w:r>
-        <w:t>Caregivers can set specific times for each medication (e.g., "Metformin at 8:00 AM and 8:00 PM, Monday through Friday"). A background job checks every 15 minutes:</w:t>
-      </w:r>
-    </w:p>
-    <w:p>
-      <w:r>
-        <w:t>1. Looks at all active reminders for the current day.</w:t>
-      </w:r>
-    </w:p>
-    <w:p>
-      <w:r>
-        <w:t>2. If the current time is within 15 minutes of a scheduled reminder, it creates a notification.</w:t>
-      </w:r>
-    </w:p>
-    <w:p>
-      <w:r>
-        <w:t>3. The caregiver can mark the reminder as "taken," "snoozed" (delays 15 minutes), or dismiss it.</w:t>
-      </w:r>
-    </w:p>
-    <w:p>
-      <w:r>
-        <w:t>4. If a reminder goes unacknowledged for more than 2 hours, it's automatically marked as "missed."</w:t>
-      </w:r>
-    </w:p>
-    <w:p>
-      <w:r>
-        <w:t>All of this feeds into the analytics dashboard as medication adherence data.</w:t>
-      </w:r>
-    </w:p>
-    <w:p>
-      <w:pPr>
-        <w:pStyle w:val="Heading1"/>
-      </w:pPr>
-      <w:r>
-        <w:t>The 16 AI Tools (Actions the AI Can Take)</w:t>
-      </w:r>
-    </w:p>
-    <w:p>
-      <w:r>
-        <w:t>When the caregiver tells the AI something actionable, the AI can use these built-in tools to save data and perform tasks:</w:t>
-      </w:r>
-    </w:p>
-    <w:p>
-      <w:pPr>
-        <w:pStyle w:val="Heading2"/>
-      </w:pPr>
-      <w:r>
-        <w:t>Medication Tools</w:t>
-      </w:r>
-    </w:p>
-    <w:p>
-      <w:pPr>
-        <w:pStyle w:val="ListBullet"/>
-      </w:pPr>
-      <w:r>
-        <w:t>Save a new medication to the profile</w:t>
-      </w:r>
-    </w:p>
-    <w:p>
-      <w:pPr>
-        <w:pStyle w:val="ListBullet"/>
-      </w:pPr>
-      <w:r>
-        <w:t>Update an existing medication (change dose, frequency, refill date)</w:t>
-      </w:r>
-    </w:p>
-    <w:p>
-      <w:pPr>
-        <w:pStyle w:val="ListBullet"/>
-      </w:pPr>
-      <w:r>
-        <w:t>Remove a discontinued medication (with reason)</w:t>
-      </w:r>
-    </w:p>
-    <w:p>
-      <w:pPr>
-        <w:pStyle w:val="ListBullet"/>
-      </w:pPr>
-      <w:r>
-        <w:t>Set a daily medication reminder at specific times</w:t>
-      </w:r>
-    </w:p>
-    <w:p>
-      <w:pPr>
-        <w:pStyle w:val="Heading2"/>
-      </w:pPr>
-      <w:r>
-        <w:t>Appointment Tools</w:t>
-      </w:r>
-    </w:p>
-    <w:p>
-      <w:pPr>
-        <w:pStyle w:val="ListBullet"/>
-      </w:pPr>
-      <w:r>
-        <w:t>Schedule a new doctor visit (doctor, date/time, purpose, location)</w:t>
-      </w:r>
-    </w:p>
-    <w:p>
-      <w:pPr>
-        <w:pStyle w:val="ListBullet"/>
-      </w:pPr>
-      <w:r>
-        <w:t>Add a new healthcare provider to the patient's care team</w:t>
-      </w:r>
-    </w:p>
-    <w:p>
-      <w:pPr>
-        <w:pStyle w:val="Heading2"/>
-      </w:pPr>
-      <w:r>
-        <w:t>Care Profile Tools</w:t>
-      </w:r>
-    </w:p>
-    <w:p>
-      <w:pPr>
-        <w:pStyle w:val="ListBullet"/>
-      </w:pPr>
-      <w:r>
-        <w:t>Update the patient's conditions, allergies, or age</w:t>
-      </w:r>
-    </w:p>
-    <w:p>
-      <w:pPr>
-        <w:pStyle w:val="Heading2"/>
-      </w:pPr>
-      <w:r>
-        <w:t>Lab Result Tools</w:t>
-      </w:r>
-    </w:p>
-    <w:p>
-      <w:pPr>
-        <w:pStyle w:val="ListBullet"/>
-      </w:pPr>
-      <w:r>
-        <w:t>Record a lab test value with its normal range and whether it's abnormal</w:t>
-      </w:r>
-    </w:p>
-    <w:p>
-      <w:pPr>
-        <w:pStyle w:val="ListBullet"/>
-      </w:pPr>
-      <w:r>
-        <w:t>Look up historical results for a specific test to see trends</w:t>
-      </w:r>
-    </w:p>
-    <w:p>
-      <w:pPr>
-        <w:pStyle w:val="Heading2"/>
-      </w:pPr>
-      <w:r>
-        <w:t>Insurance Tools</w:t>
-      </w:r>
-    </w:p>
-    <w:p>
-      <w:pPr>
-        <w:pStyle w:val="ListBullet"/>
-      </w:pPr>
-      <w:r>
-        <w:t>Update insurance plan details (provider, member ID, deductible, out-of-pocket limits)</w:t>
-      </w:r>
-    </w:p>
-    <w:p>
-      <w:pPr>
-        <w:pStyle w:val="ListBullet"/>
-      </w:pPr>
-      <w:r>
-        <w:t>Estimate what the patient would owe for a service based on their insurance</w:t>
-      </w:r>
-    </w:p>
-    <w:p>
-      <w:pPr>
-        <w:pStyle w:val="Heading2"/>
-      </w:pPr>
-      <w:r>
-        <w:t>Visit Management Tools</w:t>
-      </w:r>
-    </w:p>
-    <w:p>
-      <w:pPr>
-        <w:pStyle w:val="ListBullet"/>
-      </w:pPr>
-      <w:r>
-        <w:t>Generate a pre-visit prep sheet (current medications, recent labs, suggested questions)</w:t>
-      </w:r>
-    </w:p>
-    <w:p>
-      <w:pPr>
-        <w:pStyle w:val="ListBullet"/>
-      </w:pPr>
-      <w:r>
-        <w:t>Save post-visit notes (summary, medication changes, follow-ups, referrals)</w:t>
-      </w:r>
-    </w:p>
-    <w:p>
-      <w:pPr>
-        <w:pStyle w:val="Heading2"/>
-      </w:pPr>
-      <w:r>
-        <w:t>Memory Tools</w:t>
-      </w:r>
-    </w:p>
-    <w:p>
-      <w:pPr>
-        <w:pStyle w:val="ListBullet"/>
-      </w:pPr>
-      <w:r>
-        <w:t>Explicitly save an important fact to long-term memory</w:t>
-      </w:r>
-    </w:p>
-    <w:p>
-      <w:pPr>
-        <w:pStyle w:val="Heading2"/>
-      </w:pPr>
-      <w:r>
-        <w:t>Health Summary Tools</w:t>
-      </w:r>
-    </w:p>
-    <w:p>
-      <w:pPr>
-        <w:pStyle w:val="ListBullet"/>
-      </w:pPr>
-      <w:r>
-        <w:t>Generate a comprehensive, printable health summary document</w:t>
-      </w:r>
-    </w:p>
-    <w:p>
-      <w:pPr>
-        <w:pStyle w:val="Heading1"/>
-      </w:pPr>
-      <w:r>
-        <w:t>Data Security &amp; Privacy</w:t>
-      </w:r>
-    </w:p>
-    <w:p>
-      <w:pPr>
-        <w:pStyle w:val="ListBullet"/>
-      </w:pPr>
-      <w:r>
-        <w:rPr>
-          <w:b/>
-        </w:rPr>
-        <w:t xml:space="preserve">Row-Level Security — </w:t>
-      </w:r>
-      <w:r>
-        <w:t>Every single database table has rules ensuring users can only see their own data. Even if someone knew the database structure, they couldn't access another user's records.</w:t>
-      </w:r>
-    </w:p>
-    <w:p>
-      <w:pPr>
-        <w:pStyle w:val="ListBullet"/>
-      </w:pPr>
-      <w:r>
-        <w:rPr>
-          <w:b/>
-        </w:rPr>
-        <w:t xml:space="preserve">Role-Based Access for Care Teams — </w:t>
-      </w:r>
-      <w:r>
-        <w:t>When data is shared via care teams, the permission level (owner/editor/viewer) is enforced at the database level.</w:t>
-      </w:r>
-    </w:p>
-    <w:p>
-      <w:pPr>
-        <w:pStyle w:val="ListBullet"/>
-      </w:pPr>
-      <w:r>
-        <w:rPr>
-          <w:b/>
-        </w:rPr>
-        <w:t xml:space="preserve">Data Export — </w:t>
-      </w:r>
-      <w:r>
-        <w:t>Caregivers can export all their data as a file at any time.</w:t>
-      </w:r>
-    </w:p>
-    <w:p>
-      <w:pPr>
-        <w:pStyle w:val="ListBullet"/>
-      </w:pPr>
-      <w:r>
-        <w:rPr>
-          <w:b/>
-        </w:rPr>
-        <w:t xml:space="preserve">Account Deletion — </w:t>
-      </w:r>
-      <w:r>
-        <w:t>Full account deletion removes all associated data — profiles, medications, appointments, messages, memories, everything.</w:t>
-      </w:r>
-    </w:p>
-    <w:p>
-      <w:pPr>
-        <w:pStyle w:val="ListBullet"/>
-      </w:pPr>
-      <w:r>
-        <w:rPr>
-          <w:b/>
-        </w:rPr>
-        <w:t xml:space="preserve">No Secrets in Code — </w:t>
-      </w:r>
-      <w:r>
-        <w:t>All passwords, API keys, and credentials are stored securely in environment variables, never in the codebase.</w:t>
-      </w:r>
-    </w:p>
-    <w:p>
-      <w:pPr>
-        <w:pStyle w:val="Heading1"/>
-      </w:pPr>
-      <w:r>
-        <w:t>AI Safety Rules</w:t>
-      </w:r>
-    </w:p>
-    <w:p>
-      <w:r>
-        <w:t>The AI follows strict medical safety guidelines built into its core instructions:</w:t>
-      </w:r>
-    </w:p>
-    <w:p>
-      <w:pPr>
-        <w:pStyle w:val="ListBullet"/>
-      </w:pPr>
-      <w:r>
-        <w:t>It never diagnoses conditions.</w:t>
-      </w:r>
-    </w:p>
-    <w:p>
-      <w:pPr>
-        <w:pStyle w:val="ListBullet"/>
-      </w:pPr>
-      <w:r>
-        <w:t>It never recommends starting, stopping, or changing medications.</w:t>
-      </w:r>
-    </w:p>
-    <w:p>
-      <w:pPr>
-        <w:pStyle w:val="ListBullet"/>
-      </w:pPr>
-      <w:r>
-        <w:t>It never declares drug combinations as safe.</w:t>
-      </w:r>
-    </w:p>
-    <w:p>
-      <w:pPr>
-        <w:pStyle w:val="ListBullet"/>
-      </w:pPr>
-      <w:r>
-        <w:t>It always defers to healthcare providers for medical decisions.</w:t>
-      </w:r>
-    </w:p>
-    <w:p>
-      <w:pPr>
-        <w:pStyle w:val="ListBullet"/>
-      </w:pPr>
-      <w:r>
-        <w:t>It includes appropriate disclaimers when discussing medical, insurance, or financial topics.</w:t>
-      </w:r>
-    </w:p>
-    <w:p>
-      <w:pPr>
-        <w:pStyle w:val="ListBullet"/>
-      </w:pPr>
-      <w:r>
-        <w:t>For emergencies, it directs to 911.</w:t>
-      </w:r>
-    </w:p>
-    <w:p>
-      <w:pPr>
-        <w:pStyle w:val="ListBullet"/>
-      </w:pPr>
-      <w:r>
-        <w:t>For mental health crises, it provides crisis resources (988 Suicide &amp; Crisis Lifeline, caregiver support hotlines).</w:t>
-      </w:r>
-    </w:p>
-    <w:p>
-      <w:r>
-        <w:t>The AI is a support tool and information organizer — not a replacement for medical professionals.</w:t>
-      </w:r>
-    </w:p>
-    <w:p>
-      <w:pPr>
-        <w:pStyle w:val="Heading1"/>
-      </w:pPr>
-      <w:r>
-        <w:t>Technical Architecture Summary</w:t>
+        <w:t>Key Metrics</w:t>
       </w:r>
     </w:p>
     <w:tbl>
       <w:tblPr>
         <w:tblStyle w:val="LightGrid-Accent1"/>
         <w:tblW w:type="auto" w:w="0"/>
-        <w:jc w:val="center"/>
-        <w:tblLook w:firstColumn="1" w:firstRow="1" w:lastColumn="0" w:lastRow="0" w:noHBand="0" w:noVBand="1" w:val="04A0"/>
-      </w:tblPr>
-      <w:tblGrid>
-        <w:gridCol w:w="2880"/>
-        <w:gridCol w:w="2880"/>
-        <w:gridCol w:w="2880"/>
-      </w:tblGrid>
-      <w:tr>
-        <w:tc>
-          <w:tcPr>
-            <w:tcW w:type="dxa" w:w="2880"/>
-          </w:tcPr>
-          <w:p>
-            <w:r>
-              <w:rPr>
-                <w:b/>
-              </w:rPr>
-              <w:t>Layer</w:t>
-            </w:r>
-          </w:p>
-        </w:tc>
-        <w:tc>
-          <w:tcPr>
-            <w:tcW w:type="dxa" w:w="2880"/>
-          </w:tcPr>
-          <w:p>
-            <w:r>
-              <w:rPr>
-                <w:b/>
-              </w:rPr>
-              <w:t>What It Does</w:t>
-            </w:r>
-          </w:p>
-        </w:tc>
-        <w:tc>
-          <w:tcPr>
-            <w:tcW w:type="dxa" w:w="2880"/>
-          </w:tcPr>
-          <w:p>
-            <w:r>
-              <w:rPr>
-                <w:b/>
-              </w:rPr>
-              <w:t>Technology</w:t>
-            </w:r>
-          </w:p>
-        </w:tc>
-      </w:tr>
-      <w:tr>
-        <w:tc>
-          <w:tcPr>
-            <w:tcW w:type="dxa" w:w="2880"/>
-          </w:tcPr>
-          <w:p>
-            <w:r>
-              <w:t>Frontend</w:t>
-            </w:r>
-          </w:p>
-        </w:tc>
-        <w:tc>
-          <w:tcPr>
-            <w:tcW w:type="dxa" w:w="2880"/>
-          </w:tcPr>
-          <w:p>
-            <w:r>
-              <w:t>All the screens, forms, chat interface</w:t>
-            </w:r>
-          </w:p>
-        </w:tc>
-        <w:tc>
-          <w:tcPr>
-            <w:tcW w:type="dxa" w:w="2880"/>
-          </w:tcPr>
-          <w:p>
-            <w:r>
-              <w:t>Next.js 14, React, Tailwind CSS</w:t>
-            </w:r>
-          </w:p>
-        </w:tc>
-      </w:tr>
-      <w:tr>
-        <w:tc>
-          <w:tcPr>
-            <w:tcW w:type="dxa" w:w="2880"/>
-          </w:tcPr>
-          <w:p>
-            <w:r>
-              <w:t>Backend</w:t>
-            </w:r>
-          </w:p>
-        </w:tc>
-        <w:tc>
-          <w:tcPr>
-            <w:tcW w:type="dxa" w:w="2880"/>
-          </w:tcPr>
-          <w:p>
-            <w:r>
-              <w:t>Handles requests, runs AI, manages data</w:t>
-            </w:r>
-          </w:p>
-        </w:tc>
-        <w:tc>
-          <w:tcPr>
-            <w:tcW w:type="dxa" w:w="2880"/>
-          </w:tcPr>
-          <w:p>
-            <w:r>
-              <w:t>Next.js API Routes</w:t>
-            </w:r>
-          </w:p>
-        </w:tc>
-      </w:tr>
-      <w:tr>
-        <w:tc>
-          <w:tcPr>
-            <w:tcW w:type="dxa" w:w="2880"/>
-          </w:tcPr>
-          <w:p>
-            <w:r>
-              <w:t>AI Brain</w:t>
-            </w:r>
-          </w:p>
-        </w:tc>
-        <w:tc>
-          <w:tcPr>
-            <w:tcW w:type="dxa" w:w="2880"/>
-          </w:tcPr>
-          <w:p>
-            <w:r>
-              <w:t>Powers the chat, specialists, memory extraction</w:t>
-            </w:r>
-          </w:p>
-        </w:tc>
-        <w:tc>
-          <w:tcPr>
-            <w:tcW w:type="dxa" w:w="2880"/>
-          </w:tcPr>
-          <w:p>
-            <w:r>
-              <w:t>Claude Sonnet 4.6 (main), Claude Haiku 4.5 (routing &amp; background)</w:t>
-            </w:r>
-          </w:p>
-        </w:tc>
-      </w:tr>
-      <w:tr>
-        <w:tc>
-          <w:tcPr>
-            <w:tcW w:type="dxa" w:w="2880"/>
-          </w:tcPr>
-          <w:p>
-            <w:r>
-              <w:t>Database</w:t>
-            </w:r>
-          </w:p>
-        </w:tc>
-        <w:tc>
-          <w:tcPr>
-            <w:tcW w:type="dxa" w:w="2880"/>
-          </w:tcPr>
-          <w:p>
-            <w:r>
-              <w:t>Stores all patient data, messages, memories</w:t>
-            </w:r>
-          </w:p>
-        </w:tc>
-        <w:tc>
-          <w:tcPr>
-            <w:tcW w:type="dxa" w:w="2880"/>
-          </w:tcPr>
-          <w:p>
-            <w:r>
-              <w:t>Supabase (PostgreSQL)</w:t>
-            </w:r>
-          </w:p>
-        </w:tc>
-      </w:tr>
-      <w:tr>
-        <w:tc>
-          <w:tcPr>
-            <w:tcW w:type="dxa" w:w="2880"/>
-          </w:tcPr>
-          <w:p>
-            <w:r>
-              <w:t>Authentication</w:t>
-            </w:r>
-          </w:p>
-        </w:tc>
-        <w:tc>
-          <w:tcPr>
-            <w:tcW w:type="dxa" w:w="2880"/>
-          </w:tcPr>
-          <w:p>
-            <w:r>
-              <w:t>Login, sessions, permissions</w:t>
-            </w:r>
-          </w:p>
-        </w:tc>
-        <w:tc>
-          <w:tcPr>
-            <w:tcW w:type="dxa" w:w="2880"/>
-          </w:tcPr>
-          <w:p>
-            <w:r>
-              <w:t>Supabase Auth</w:t>
-            </w:r>
-          </w:p>
-        </w:tc>
-      </w:tr>
-      <w:tr>
-        <w:tc>
-          <w:tcPr>
-            <w:tcW w:type="dxa" w:w="2880"/>
-          </w:tcPr>
-          <w:p>
-            <w:r>
-              <w:t>Health Data Import</w:t>
-            </w:r>
-          </w:p>
-        </w:tc>
-        <w:tc>
-          <w:tcPr>
-            <w:tcW w:type="dxa" w:w="2880"/>
-          </w:tcPr>
-          <w:p>
-            <w:r>
-              <w:t>Pulls records from hospitals</w:t>
-            </w:r>
-          </w:p>
-        </w:tc>
-        <w:tc>
-          <w:tcPr>
-            <w:tcW w:type="dxa" w:w="2880"/>
-          </w:tcPr>
-          <w:p>
-            <w:r>
-              <w:t>FHIR standard via 1upHealth / Epic</w:t>
-            </w:r>
-          </w:p>
-        </w:tc>
-      </w:tr>
-      <w:tr>
-        <w:tc>
-          <w:tcPr>
-            <w:tcW w:type="dxa" w:w="2880"/>
-          </w:tcPr>
-          <w:p>
-            <w:r>
-              <w:t>Background Jobs</w:t>
-            </w:r>
-          </w:p>
-        </w:tc>
-        <w:tc>
-          <w:tcPr>
-            <w:tcW w:type="dxa" w:w="2880"/>
-          </w:tcPr>
-          <w:p>
-            <w:r>
-              <w:t>Notifications, reminders every 15 min</w:t>
-            </w:r>
-          </w:p>
-        </w:tc>
-        <w:tc>
-          <w:tcPr>
-            <w:tcW w:type="dxa" w:w="2880"/>
-          </w:tcPr>
-          <w:p>
-            <w:r>
-              <w:t>Vercel Cron</w:t>
-            </w:r>
-          </w:p>
-        </w:tc>
-      </w:tr>
-      <w:tr>
-        <w:tc>
-          <w:tcPr>
-            <w:tcW w:type="dxa" w:w="2880"/>
-          </w:tcPr>
-          <w:p>
-            <w:r>
-              <w:t>Hosting</w:t>
-            </w:r>
-          </w:p>
-        </w:tc>
-        <w:tc>
-          <w:tcPr>
-            <w:tcW w:type="dxa" w:w="2880"/>
-          </w:tcPr>
-          <w:p>
-            <w:r>
-              <w:t>Runs the app in the cloud</w:t>
-            </w:r>
-          </w:p>
-        </w:tc>
-        <w:tc>
-          <w:tcPr>
-            <w:tcW w:type="dxa" w:w="2880"/>
-          </w:tcPr>
-          <w:p>
-            <w:r>
-              <w:t>Vercel</w:t>
-            </w:r>
-          </w:p>
-        </w:tc>
-      </w:tr>
-    </w:tbl>
-    <w:p>
-      <w:pPr>
-        <w:pStyle w:val="Heading1"/>
-      </w:pPr>
-      <w:r>
-        <w:t>Database: What's Stored (22 Tables)</w:t>
-      </w:r>
-    </w:p>
-    <w:tbl>
-      <w:tblPr>
-        <w:tblStyle w:val="LightGrid-Accent1"/>
-        <w:tblW w:type="auto" w:w="0"/>
-        <w:jc w:val="center"/>
         <w:tblLook w:firstColumn="1" w:firstRow="1" w:lastColumn="0" w:lastRow="0" w:noHBand="0" w:noVBand="1" w:val="04A0"/>
       </w:tblPr>
       <w:tblGrid>
@@ -1378,9 +252,1703 @@
           </w:tcPr>
           <w:p>
             <w:r>
-              <w:rPr>
-                <w:b/>
-              </w:rPr>
+              <w:t>Total Pages/Views</w:t>
+            </w:r>
+          </w:p>
+        </w:tc>
+        <w:tc>
+          <w:tcPr>
+            <w:tcW w:type="dxa" w:w="4320"/>
+          </w:tcPr>
+          <w:p>
+            <w:r>
+              <w:t>20+ pages</w:t>
+            </w:r>
+          </w:p>
+        </w:tc>
+      </w:tr>
+      <w:tr>
+        <w:tc>
+          <w:tcPr>
+            <w:tcW w:type="dxa" w:w="4320"/>
+          </w:tcPr>
+          <w:p>
+            <w:r>
+              <w:t>API Endpoints</w:t>
+            </w:r>
+          </w:p>
+        </w:tc>
+        <w:tc>
+          <w:tcPr>
+            <w:tcW w:type="dxa" w:w="4320"/>
+          </w:tcPr>
+          <w:p>
+            <w:r>
+              <w:t>46 endpoints</w:t>
+            </w:r>
+          </w:p>
+        </w:tc>
+      </w:tr>
+      <w:tr>
+        <w:tc>
+          <w:tcPr>
+            <w:tcW w:type="dxa" w:w="4320"/>
+          </w:tcPr>
+          <w:p>
+            <w:r>
+              <w:t>UI Components</w:t>
+            </w:r>
+          </w:p>
+        </w:tc>
+        <w:tc>
+          <w:tcPr>
+            <w:tcW w:type="dxa" w:w="4320"/>
+          </w:tcPr>
+          <w:p>
+            <w:r>
+              <w:t>55 components</w:t>
+            </w:r>
+          </w:p>
+        </w:tc>
+      </w:tr>
+      <w:tr>
+        <w:tc>
+          <w:tcPr>
+            <w:tcW w:type="dxa" w:w="4320"/>
+          </w:tcPr>
+          <w:p>
+            <w:r>
+              <w:t>AI Tools (callable)</w:t>
+            </w:r>
+          </w:p>
+        </w:tc>
+        <w:tc>
+          <w:tcPr>
+            <w:tcW w:type="dxa" w:w="4320"/>
+          </w:tcPr>
+          <w:p>
+            <w:r>
+              <w:t>16 tools</w:t>
+            </w:r>
+          </w:p>
+        </w:tc>
+      </w:tr>
+      <w:tr>
+        <w:tc>
+          <w:tcPr>
+            <w:tcW w:type="dxa" w:w="4320"/>
+          </w:tcPr>
+          <w:p>
+            <w:r>
+              <w:t>Database Tables</w:t>
+            </w:r>
+          </w:p>
+        </w:tc>
+        <w:tc>
+          <w:tcPr>
+            <w:tcW w:type="dxa" w:w="4320"/>
+          </w:tcPr>
+          <w:p>
+            <w:r>
+              <w:t>23 tables</w:t>
+            </w:r>
+          </w:p>
+        </w:tc>
+      </w:tr>
+      <w:tr>
+        <w:tc>
+          <w:tcPr>
+            <w:tcW w:type="dxa" w:w="4320"/>
+          </w:tcPr>
+          <w:p>
+            <w:r>
+              <w:t>Health Integrations</w:t>
+            </w:r>
+          </w:p>
+        </w:tc>
+        <w:tc>
+          <w:tcPr>
+            <w:tcW w:type="dxa" w:w="4320"/>
+          </w:tcPr>
+          <w:p>
+            <w:r>
+              <w:t>6 providers</w:t>
+            </w:r>
+          </w:p>
+        </w:tc>
+      </w:tr>
+    </w:tbl>
+    <w:p/>
+    <w:p>
+      <w:pPr>
+        <w:pStyle w:val="Heading1"/>
+      </w:pPr>
+      <w:r>
+        <w:t>2. Product Overview</w:t>
+      </w:r>
+    </w:p>
+    <w:p>
+      <w:pPr>
+        <w:pStyle w:val="Heading2"/>
+      </w:pPr>
+      <w:r>
+        <w:t>What CareCompanion Does</w:t>
+      </w:r>
+    </w:p>
+    <w:p>
+      <w:r>
+        <w:rPr>
+          <w:b/>
+        </w:rPr>
+        <w:t xml:space="preserve">AI Cancer Care Chat: </w:t>
+      </w:r>
+      <w:r>
+        <w:t>Multi-agent AI that understands chemo regimens (FOLFOX, AC-T, R-CHOP), drug interactions, tumor markers, and treatment cycles. Provides specific, personalized answers — not generic health info.</w:t>
+      </w:r>
+    </w:p>
+    <w:p>
+      <w:r>
+        <w:rPr>
+          <w:b/>
+        </w:rPr>
+        <w:t xml:space="preserve">Medication Management: </w:t>
+      </w:r>
+      <w:r>
+        <w:t>Track all medications with doses, frequencies, refill dates, prescribing doctors. Automatic drug interaction checking. Refill reminders.</w:t>
+      </w:r>
+    </w:p>
+    <w:p>
+      <w:r>
+        <w:rPr>
+          <w:b/>
+        </w:rPr>
+        <w:t xml:space="preserve">Lab Result Tracking: </w:t>
+      </w:r>
+      <w:r>
+        <w:t>Import and interpret lab results including CBC, tumor markers (CEA, CA-125, PSA), kidney/liver function. Flags abnormal values with context.</w:t>
+      </w:r>
+    </w:p>
+    <w:p>
+      <w:r>
+        <w:rPr>
+          <w:b/>
+        </w:rPr>
+        <w:t xml:space="preserve">Appointment Preparation: </w:t>
+      </w:r>
+      <w:r>
+        <w:t>Generate tailored question lists for oncology visits based on treatment phase, recent labs, and current symptoms.</w:t>
+      </w:r>
+    </w:p>
+    <w:p>
+      <w:r>
+        <w:rPr>
+          <w:b/>
+        </w:rPr>
+        <w:t xml:space="preserve">Treatment Journal: </w:t>
+      </w:r>
+      <w:r>
+        <w:t>Daily symptom logging with nausea level, fatigue level, pain, mood, sleep quality, appetite, and energy tracking. Cancer-specific symptoms.</w:t>
+      </w:r>
+    </w:p>
+    <w:p>
+      <w:r>
+        <w:rPr>
+          <w:b/>
+        </w:rPr>
+        <w:t xml:space="preserve">Document Scanner: </w:t>
+      </w:r>
+      <w:r>
+        <w:t>Photo-scan pill bottles, lab reports, insurance cards, and medical bills. AI extracts structured data automatically.</w:t>
+      </w:r>
+    </w:p>
+    <w:p>
+      <w:r>
+        <w:rPr>
+          <w:b/>
+        </w:rPr>
+        <w:t xml:space="preserve">Insurance Navigator: </w:t>
+      </w:r>
+      <w:r>
+        <w:t>Track claims, denied claims, prior authorizations, FSA/HSA balances. AI helps with appeal letters and cost estimation.</w:t>
+      </w:r>
+    </w:p>
+    <w:p>
+      <w:r>
+        <w:rPr>
+          <w:b/>
+        </w:rPr>
+        <w:t xml:space="preserve">Treatment Cycle Tracker: </w:t>
+      </w:r>
+      <w:r>
+        <w:t>Visual progress bar showing current day in chemo cycle, phase detection (infusion/nadir/recovery), and overall treatment progress.</w:t>
+      </w:r>
+    </w:p>
+    <w:p>
+      <w:r>
+        <w:rPr>
+          <w:b/>
+        </w:rPr>
+        <w:t xml:space="preserve">Health Summary &amp; PDF Export: </w:t>
+      </w:r>
+      <w:r>
+        <w:t>One-tap comprehensive health summary with PDF download and shareable links for doctor visits.</w:t>
+      </w:r>
+    </w:p>
+    <w:p>
+      <w:r>
+        <w:rPr>
+          <w:b/>
+        </w:rPr>
+        <w:t xml:space="preserve">Care Team Collaboration: </w:t>
+      </w:r>
+      <w:r>
+        <w:t>Invite family members to share care access with role-based permissions (owner/editor/viewer).</w:t>
+      </w:r>
+    </w:p>
+    <w:p>
+      <w:r>
+        <w:rPr>
+          <w:b/>
+        </w:rPr>
+        <w:t xml:space="preserve">Emergency Card: </w:t>
+      </w:r>
+      <w:r>
+        <w:t>Quick-access card with patient info, medications, allergies, emergency contacts — designed for paramedics and ER visits.</w:t>
+      </w:r>
+    </w:p>
+    <w:p>
+      <w:r>
+        <w:rPr>
+          <w:b/>
+        </w:rPr>
+        <w:t xml:space="preserve">Proactive Notifications: </w:t>
+      </w:r>
+      <w:r>
+        <w:t>Smart alerts for medication refills, upcoming appointments, expiring prior authorizations, and abnormal lab results.</w:t>
+      </w:r>
+    </w:p>
+    <w:p>
+      <w:pPr>
+        <w:pStyle w:val="Heading2"/>
+      </w:pPr>
+      <w:r>
+        <w:t>Target User</w:t>
+      </w:r>
+    </w:p>
+    <w:p>
+      <w:r>
+        <w:t>Primary: Cancer caregivers — the spouse, adult child, or parent managing someone else's cancer treatment. They are the human integration layer between fragmented healthcare systems.</w:t>
+        <w:br/>
+        <w:br/>
+        <w:t>Secondary: Cancer patients managing their own care.</w:t>
+        <w:br/>
+        <w:br/>
+        <w:t>Not targeting: Healthcare providers or clinical staff.</w:t>
+      </w:r>
+    </w:p>
+    <w:p>
+      <w:pPr>
+        <w:pStyle w:val="Heading1"/>
+      </w:pPr>
+      <w:r>
+        <w:t>3. User Experience &amp; Flows</w:t>
+      </w:r>
+    </w:p>
+    <w:p>
+      <w:pPr>
+        <w:pStyle w:val="Heading2"/>
+      </w:pPr>
+      <w:r>
+        <w:t>User Journey</w:t>
+      </w:r>
+    </w:p>
+    <w:p>
+      <w:pPr>
+        <w:pStyle w:val="ListBullet"/>
+      </w:pPr>
+      <w:r>
+        <w:t>User lands on carecompanionai.org landing page</w:t>
+      </w:r>
+    </w:p>
+    <w:p>
+      <w:pPr>
+        <w:pStyle w:val="ListBullet"/>
+      </w:pPr>
+      <w:r>
+        <w:t>Signs up with Google OAuth or email/password</w:t>
+      </w:r>
+    </w:p>
+    <w:p>
+      <w:pPr>
+        <w:pStyle w:val="ListBullet"/>
+      </w:pPr>
+      <w:r>
+        <w:t>Goes through 4-step onboarding wizard:</w:t>
+      </w:r>
+    </w:p>
+    <w:p>
+      <w:pPr>
+        <w:pStyle w:val="ListBullet"/>
+      </w:pPr>
+      <w:r>
+        <w:t xml:space="preserve">  Step 1: Patient vs caregiver selection</w:t>
+      </w:r>
+    </w:p>
+    <w:p>
+      <w:pPr>
+        <w:pStyle w:val="ListBullet"/>
+      </w:pPr>
+      <w:r>
+        <w:t xml:space="preserve">  Step 2: Cancer type, stage, treatment phase</w:t>
+      </w:r>
+    </w:p>
+    <w:p>
+      <w:pPr>
+        <w:pStyle w:val="ListBullet"/>
+      </w:pPr>
+      <w:r>
+        <w:t xml:space="preserve">  Step 3: Data source (connect records, scan docs, manual, demo)</w:t>
+      </w:r>
+    </w:p>
+    <w:p>
+      <w:pPr>
+        <w:pStyle w:val="ListBullet"/>
+      </w:pPr>
+      <w:r>
+        <w:t xml:space="preserve">  Step 4: Priority preferences (side effects, meds, appointments, labs, insurance, emotional)</w:t>
+      </w:r>
+    </w:p>
+    <w:p>
+      <w:pPr>
+        <w:pStyle w:val="ListBullet"/>
+      </w:pPr>
+      <w:r>
+        <w:t>Lands on personalized dashboard with cancer badges and priority-ordered cards</w:t>
+      </w:r>
+    </w:p>
+    <w:p>
+      <w:pPr>
+        <w:pStyle w:val="ListBullet"/>
+      </w:pPr>
+      <w:r>
+        <w:t>Uses AI chat as primary interaction — ask anything about cancer care</w:t>
+      </w:r>
+    </w:p>
+    <w:p>
+      <w:pPr>
+        <w:pStyle w:val="ListBullet"/>
+      </w:pPr>
+      <w:r>
+        <w:t>Dashboard shows actionable items: refill alerts, upcoming appointments, abnormal labs</w:t>
+      </w:r>
+    </w:p>
+    <w:p>
+      <w:pPr>
+        <w:pStyle w:val="ListBullet"/>
+      </w:pPr>
+      <w:r>
+        <w:t>Can connect health records (Epic, 1upHealth) for automated data import</w:t>
+      </w:r>
+    </w:p>
+    <w:p>
+      <w:pPr>
+        <w:pStyle w:val="Heading2"/>
+      </w:pPr>
+      <w:r>
+        <w:t>Page Map</w:t>
+      </w:r>
+    </w:p>
+    <w:tbl>
+      <w:tblPr>
+        <w:tblStyle w:val="LightGrid-Accent1"/>
+        <w:tblW w:type="auto" w:w="0"/>
+        <w:tblLook w:firstColumn="1" w:firstRow="1" w:lastColumn="0" w:lastRow="0" w:noHBand="0" w:noVBand="1" w:val="04A0"/>
+      </w:tblPr>
+      <w:tblGrid>
+        <w:gridCol w:w="4320"/>
+        <w:gridCol w:w="4320"/>
+      </w:tblGrid>
+      <w:tr>
+        <w:tc>
+          <w:tcPr>
+            <w:tcW w:type="dxa" w:w="4320"/>
+          </w:tcPr>
+          <w:p>
+            <w:r>
+              <w:t>Route</w:t>
+            </w:r>
+          </w:p>
+        </w:tc>
+        <w:tc>
+          <w:tcPr>
+            <w:tcW w:type="dxa" w:w="4320"/>
+          </w:tcPr>
+          <w:p>
+            <w:r>
+              <w:t>Description</w:t>
+            </w:r>
+          </w:p>
+        </w:tc>
+      </w:tr>
+      <w:tr>
+        <w:tc>
+          <w:tcPr>
+            <w:tcW w:type="dxa" w:w="4320"/>
+          </w:tcPr>
+          <w:p>
+            <w:r>
+              <w:t>/</w:t>
+            </w:r>
+          </w:p>
+        </w:tc>
+        <w:tc>
+          <w:tcPr>
+            <w:tcW w:type="dxa" w:w="4320"/>
+          </w:tcPr>
+          <w:p>
+            <w:r>
+              <w:t>Landing page — hero, features, CTA</w:t>
+            </w:r>
+          </w:p>
+        </w:tc>
+      </w:tr>
+      <w:tr>
+        <w:tc>
+          <w:tcPr>
+            <w:tcW w:type="dxa" w:w="4320"/>
+          </w:tcPr>
+          <w:p>
+            <w:r>
+              <w:t>/login</w:t>
+            </w:r>
+          </w:p>
+        </w:tc>
+        <w:tc>
+          <w:tcPr>
+            <w:tcW w:type="dxa" w:w="4320"/>
+          </w:tcPr>
+          <w:p>
+            <w:r>
+              <w:t>Google OAuth + email/password login</w:t>
+            </w:r>
+          </w:p>
+        </w:tc>
+      </w:tr>
+      <w:tr>
+        <w:tc>
+          <w:tcPr>
+            <w:tcW w:type="dxa" w:w="4320"/>
+          </w:tcPr>
+          <w:p>
+            <w:r>
+              <w:t>/onboarding</w:t>
+            </w:r>
+          </w:p>
+        </w:tc>
+        <w:tc>
+          <w:tcPr>
+            <w:tcW w:type="dxa" w:w="4320"/>
+          </w:tcPr>
+          <w:p>
+            <w:r>
+              <w:t>4-step setup wizard</w:t>
+            </w:r>
+          </w:p>
+        </w:tc>
+      </w:tr>
+      <w:tr>
+        <w:tc>
+          <w:tcPr>
+            <w:tcW w:type="dxa" w:w="4320"/>
+          </w:tcPr>
+          <w:p>
+            <w:r>
+              <w:t>/dashboard</w:t>
+            </w:r>
+          </w:p>
+        </w:tc>
+        <w:tc>
+          <w:tcPr>
+            <w:tcW w:type="dxa" w:w="4320"/>
+          </w:tcPr>
+          <w:p>
+            <w:r>
+              <w:t>Home — priority cards, treatment tracker, quick-ask</w:t>
+            </w:r>
+          </w:p>
+        </w:tc>
+      </w:tr>
+      <w:tr>
+        <w:tc>
+          <w:tcPr>
+            <w:tcW w:type="dxa" w:w="4320"/>
+          </w:tcPr>
+          <w:p>
+            <w:r>
+              <w:t>/chat</w:t>
+            </w:r>
+          </w:p>
+        </w:tc>
+        <w:tc>
+          <w:tcPr>
+            <w:tcW w:type="dxa" w:w="4320"/>
+          </w:tcPr>
+          <w:p>
+            <w:r>
+              <w:t>AI chat with multi-agent orchestration</w:t>
+            </w:r>
+          </w:p>
+        </w:tc>
+      </w:tr>
+      <w:tr>
+        <w:tc>
+          <w:tcPr>
+            <w:tcW w:type="dxa" w:w="4320"/>
+          </w:tcPr>
+          <w:p>
+            <w:r>
+              <w:t>/medications</w:t>
+            </w:r>
+          </w:p>
+        </w:tc>
+        <w:tc>
+          <w:tcPr>
+            <w:tcW w:type="dxa" w:w="4320"/>
+          </w:tcPr>
+          <w:p>
+            <w:r>
+              <w:t>Medication list with interaction checking</w:t>
+            </w:r>
+          </w:p>
+        </w:tc>
+      </w:tr>
+      <w:tr>
+        <w:tc>
+          <w:tcPr>
+            <w:tcW w:type="dxa" w:w="4320"/>
+          </w:tcPr>
+          <w:p>
+            <w:r>
+              <w:t>/appointments</w:t>
+            </w:r>
+          </w:p>
+        </w:tc>
+        <w:tc>
+          <w:tcPr>
+            <w:tcW w:type="dxa" w:w="4320"/>
+          </w:tcPr>
+          <w:p>
+            <w:r>
+              <w:t>Appointment calendar and visit prep</w:t>
+            </w:r>
+          </w:p>
+        </w:tc>
+      </w:tr>
+      <w:tr>
+        <w:tc>
+          <w:tcPr>
+            <w:tcW w:type="dxa" w:w="4320"/>
+          </w:tcPr>
+          <w:p>
+            <w:r>
+              <w:t>/journal</w:t>
+            </w:r>
+          </w:p>
+        </w:tc>
+        <w:tc>
+          <w:tcPr>
+            <w:tcW w:type="dxa" w:w="4320"/>
+          </w:tcPr>
+          <w:p>
+            <w:r>
+              <w:t>Daily symptom/side effect tracker</w:t>
+            </w:r>
+          </w:p>
+        </w:tc>
+      </w:tr>
+      <w:tr>
+        <w:tc>
+          <w:tcPr>
+            <w:tcW w:type="dxa" w:w="4320"/>
+          </w:tcPr>
+          <w:p>
+            <w:r>
+              <w:t>/scans</w:t>
+            </w:r>
+          </w:p>
+        </w:tc>
+        <w:tc>
+          <w:tcPr>
+            <w:tcW w:type="dxa" w:w="4320"/>
+          </w:tcPr>
+          <w:p>
+            <w:r>
+              <w:t>Document scanner (photos → structured data)</w:t>
+            </w:r>
+          </w:p>
+        </w:tc>
+      </w:tr>
+      <w:tr>
+        <w:tc>
+          <w:tcPr>
+            <w:tcW w:type="dxa" w:w="4320"/>
+          </w:tcPr>
+          <w:p>
+            <w:r>
+              <w:t>/health-summary</w:t>
+            </w:r>
+          </w:p>
+        </w:tc>
+        <w:tc>
+          <w:tcPr>
+            <w:tcW w:type="dxa" w:w="4320"/>
+          </w:tcPr>
+          <w:p>
+            <w:r>
+              <w:t>Comprehensive summary with PDF export</w:t>
+            </w:r>
+          </w:p>
+        </w:tc>
+      </w:tr>
+      <w:tr>
+        <w:tc>
+          <w:tcPr>
+            <w:tcW w:type="dxa" w:w="4320"/>
+          </w:tcPr>
+          <w:p>
+            <w:r>
+              <w:t>/calendar</w:t>
+            </w:r>
+          </w:p>
+        </w:tc>
+        <w:tc>
+          <w:tcPr>
+            <w:tcW w:type="dxa" w:w="4320"/>
+          </w:tcPr>
+          <w:p>
+            <w:r>
+              <w:t>Monthly view with appointment/refill dots</w:t>
+            </w:r>
+          </w:p>
+        </w:tc>
+      </w:tr>
+      <w:tr>
+        <w:tc>
+          <w:tcPr>
+            <w:tcW w:type="dxa" w:w="4320"/>
+          </w:tcPr>
+          <w:p>
+            <w:r>
+              <w:t>/analytics</w:t>
+            </w:r>
+          </w:p>
+        </w:tc>
+        <w:tc>
+          <w:tcPr>
+            <w:tcW w:type="dxa" w:w="4320"/>
+          </w:tcPr>
+          <w:p>
+            <w:r>
+              <w:t>Adherence, symptom trends, lab trends</w:t>
+            </w:r>
+          </w:p>
+        </w:tc>
+      </w:tr>
+      <w:tr>
+        <w:tc>
+          <w:tcPr>
+            <w:tcW w:type="dxa" w:w="4320"/>
+          </w:tcPr>
+          <w:p>
+            <w:r>
+              <w:t>/emergency</w:t>
+            </w:r>
+          </w:p>
+        </w:tc>
+        <w:tc>
+          <w:tcPr>
+            <w:tcW w:type="dxa" w:w="4320"/>
+          </w:tcPr>
+          <w:p>
+            <w:r>
+              <w:t>Emergency info card for ER/paramedics</w:t>
+            </w:r>
+          </w:p>
+        </w:tc>
+      </w:tr>
+      <w:tr>
+        <w:tc>
+          <w:tcPr>
+            <w:tcW w:type="dxa" w:w="4320"/>
+          </w:tcPr>
+          <w:p>
+            <w:r>
+              <w:t>/care-team</w:t>
+            </w:r>
+          </w:p>
+        </w:tc>
+        <w:tc>
+          <w:tcPr>
+            <w:tcW w:type="dxa" w:w="4320"/>
+          </w:tcPr>
+          <w:p>
+            <w:r>
+              <w:t>Invite family, manage roles, activity feed</w:t>
+            </w:r>
+          </w:p>
+        </w:tc>
+      </w:tr>
+      <w:tr>
+        <w:tc>
+          <w:tcPr>
+            <w:tcW w:type="dxa" w:w="4320"/>
+          </w:tcPr>
+          <w:p>
+            <w:r>
+              <w:t>/connect</w:t>
+            </w:r>
+          </w:p>
+        </w:tc>
+        <w:tc>
+          <w:tcPr>
+            <w:tcW w:type="dxa" w:w="4320"/>
+          </w:tcPr>
+          <w:p>
+            <w:r>
+              <w:t>Health system OAuth integrations</w:t>
+            </w:r>
+          </w:p>
+        </w:tc>
+      </w:tr>
+      <w:tr>
+        <w:tc>
+          <w:tcPr>
+            <w:tcW w:type="dxa" w:w="4320"/>
+          </w:tcPr>
+          <w:p>
+            <w:r>
+              <w:t>/settings</w:t>
+            </w:r>
+          </w:p>
+        </w:tc>
+        <w:tc>
+          <w:tcPr>
+            <w:tcW w:type="dxa" w:w="4320"/>
+          </w:tcPr>
+          <w:p>
+            <w:r>
+              <w:t>Notification preferences, AI personality, profile edit</w:t>
+            </w:r>
+          </w:p>
+        </w:tc>
+      </w:tr>
+      <w:tr>
+        <w:tc>
+          <w:tcPr>
+            <w:tcW w:type="dxa" w:w="4320"/>
+          </w:tcPr>
+          <w:p>
+            <w:r>
+              <w:t>/privacy</w:t>
+            </w:r>
+          </w:p>
+        </w:tc>
+        <w:tc>
+          <w:tcPr>
+            <w:tcW w:type="dxa" w:w="4320"/>
+          </w:tcPr>
+          <w:p>
+            <w:r>
+              <w:t>Privacy policy</w:t>
+            </w:r>
+          </w:p>
+        </w:tc>
+      </w:tr>
+      <w:tr>
+        <w:tc>
+          <w:tcPr>
+            <w:tcW w:type="dxa" w:w="4320"/>
+          </w:tcPr>
+          <w:p>
+            <w:r>
+              <w:t>/terms</w:t>
+            </w:r>
+          </w:p>
+        </w:tc>
+        <w:tc>
+          <w:tcPr>
+            <w:tcW w:type="dxa" w:w="4320"/>
+          </w:tcPr>
+          <w:p>
+            <w:r>
+              <w:t>Terms of service</w:t>
+            </w:r>
+          </w:p>
+        </w:tc>
+      </w:tr>
+      <w:tr>
+        <w:tc>
+          <w:tcPr>
+            <w:tcW w:type="dxa" w:w="4320"/>
+          </w:tcPr>
+          <w:p>
+            <w:r>
+              <w:t>/about</w:t>
+            </w:r>
+          </w:p>
+        </w:tc>
+        <w:tc>
+          <w:tcPr>
+            <w:tcW w:type="dxa" w:w="4320"/>
+          </w:tcPr>
+          <w:p>
+            <w:r>
+              <w:t>About page with mission, team, contact</w:t>
+            </w:r>
+          </w:p>
+        </w:tc>
+      </w:tr>
+    </w:tbl>
+    <w:p/>
+    <w:p>
+      <w:pPr>
+        <w:pStyle w:val="Heading1"/>
+      </w:pPr>
+      <w:r>
+        <w:t>4. Technology Stack</w:t>
+      </w:r>
+    </w:p>
+    <w:tbl>
+      <w:tblPr>
+        <w:tblStyle w:val="LightGrid-Accent1"/>
+        <w:tblW w:type="auto" w:w="0"/>
+        <w:tblLook w:firstColumn="1" w:firstRow="1" w:lastColumn="0" w:lastRow="0" w:noHBand="0" w:noVBand="1" w:val="04A0"/>
+      </w:tblPr>
+      <w:tblGrid>
+        <w:gridCol w:w="4320"/>
+        <w:gridCol w:w="4320"/>
+      </w:tblGrid>
+      <w:tr>
+        <w:tc>
+          <w:tcPr>
+            <w:tcW w:type="dxa" w:w="4320"/>
+          </w:tcPr>
+          <w:p>
+            <w:r>
+              <w:t>Layer</w:t>
+            </w:r>
+          </w:p>
+        </w:tc>
+        <w:tc>
+          <w:tcPr>
+            <w:tcW w:type="dxa" w:w="4320"/>
+          </w:tcPr>
+          <w:p>
+            <w:r>
+              <w:t>Technology</w:t>
+            </w:r>
+          </w:p>
+        </w:tc>
+      </w:tr>
+      <w:tr>
+        <w:tc>
+          <w:tcPr>
+            <w:tcW w:type="dxa" w:w="4320"/>
+          </w:tcPr>
+          <w:p>
+            <w:r>
+              <w:t>Frontend</w:t>
+            </w:r>
+          </w:p>
+        </w:tc>
+        <w:tc>
+          <w:tcPr>
+            <w:tcW w:type="dxa" w:w="4320"/>
+          </w:tcPr>
+          <w:p>
+            <w:r>
+              <w:t>Next.js 14.2 (React 18), Tailwind CSS 3.4, TypeScript 5</w:t>
+            </w:r>
+          </w:p>
+        </w:tc>
+      </w:tr>
+      <w:tr>
+        <w:tc>
+          <w:tcPr>
+            <w:tcW w:type="dxa" w:w="4320"/>
+          </w:tcPr>
+          <w:p>
+            <w:r>
+              <w:t>Backend</w:t>
+            </w:r>
+          </w:p>
+        </w:tc>
+        <w:tc>
+          <w:tcPr>
+            <w:tcW w:type="dxa" w:w="4320"/>
+          </w:tcPr>
+          <w:p>
+            <w:r>
+              <w:t>Next.js API Routes (Node.js), Supabase (PostgreSQL + Auth)</w:t>
+            </w:r>
+          </w:p>
+        </w:tc>
+      </w:tr>
+      <w:tr>
+        <w:tc>
+          <w:tcPr>
+            <w:tcW w:type="dxa" w:w="4320"/>
+          </w:tcPr>
+          <w:p>
+            <w:r>
+              <w:t>AI</w:t>
+            </w:r>
+          </w:p>
+        </w:tc>
+        <w:tc>
+          <w:tcPr>
+            <w:tcW w:type="dxa" w:w="4320"/>
+          </w:tcPr>
+          <w:p>
+            <w:r>
+              <w:t>Anthropic Claude API (Sonnet 3.5 for chat, Haiku for routing/memory)</w:t>
+            </w:r>
+          </w:p>
+        </w:tc>
+      </w:tr>
+      <w:tr>
+        <w:tc>
+          <w:tcPr>
+            <w:tcW w:type="dxa" w:w="4320"/>
+          </w:tcPr>
+          <w:p>
+            <w:r>
+              <w:t>AI SDK</w:t>
+            </w:r>
+          </w:p>
+        </w:tc>
+        <w:tc>
+          <w:tcPr>
+            <w:tcW w:type="dxa" w:w="4320"/>
+          </w:tcPr>
+          <w:p>
+            <w:r>
+              <w:t>Vercel AI SDK (ai, @ai-sdk/anthropic, @ai-sdk/react)</w:t>
+            </w:r>
+          </w:p>
+        </w:tc>
+      </w:tr>
+      <w:tr>
+        <w:tc>
+          <w:tcPr>
+            <w:tcW w:type="dxa" w:w="4320"/>
+          </w:tcPr>
+          <w:p>
+            <w:r>
+              <w:t>Hosting</w:t>
+            </w:r>
+          </w:p>
+        </w:tc>
+        <w:tc>
+          <w:tcPr>
+            <w:tcW w:type="dxa" w:w="4320"/>
+          </w:tcPr>
+          <w:p>
+            <w:r>
+              <w:t>Vercel (deployment, cron jobs, edge functions)</w:t>
+            </w:r>
+          </w:p>
+        </w:tc>
+      </w:tr>
+      <w:tr>
+        <w:tc>
+          <w:tcPr>
+            <w:tcW w:type="dxa" w:w="4320"/>
+          </w:tcPr>
+          <w:p>
+            <w:r>
+              <w:t>Database</w:t>
+            </w:r>
+          </w:p>
+        </w:tc>
+        <w:tc>
+          <w:tcPr>
+            <w:tcW w:type="dxa" w:w="4320"/>
+          </w:tcPr>
+          <w:p>
+            <w:r>
+              <w:t>Supabase PostgreSQL with Row-Level Security</w:t>
+            </w:r>
+          </w:p>
+        </w:tc>
+      </w:tr>
+      <w:tr>
+        <w:tc>
+          <w:tcPr>
+            <w:tcW w:type="dxa" w:w="4320"/>
+          </w:tcPr>
+          <w:p>
+            <w:r>
+              <w:t>Auth</w:t>
+            </w:r>
+          </w:p>
+        </w:tc>
+        <w:tc>
+          <w:tcPr>
+            <w:tcW w:type="dxa" w:w="4320"/>
+          </w:tcPr>
+          <w:p>
+            <w:r>
+              <w:t>Supabase Auth (Google OAuth, email/password)</w:t>
+            </w:r>
+          </w:p>
+        </w:tc>
+      </w:tr>
+      <w:tr>
+        <w:tc>
+          <w:tcPr>
+            <w:tcW w:type="dxa" w:w="4320"/>
+          </w:tcPr>
+          <w:p>
+            <w:r>
+              <w:t>Validation</w:t>
+            </w:r>
+          </w:p>
+        </w:tc>
+        <w:tc>
+          <w:tcPr>
+            <w:tcW w:type="dxa" w:w="4320"/>
+          </w:tcPr>
+          <w:p>
+            <w:r>
+              <w:t>Zod 4.3 (schema validation for document extraction)</w:t>
+            </w:r>
+          </w:p>
+        </w:tc>
+      </w:tr>
+      <w:tr>
+        <w:tc>
+          <w:tcPr>
+            <w:tcW w:type="dxa" w:w="4320"/>
+          </w:tcPr>
+          <w:p>
+            <w:r>
+              <w:t>Testing</w:t>
+            </w:r>
+          </w:p>
+        </w:tc>
+        <w:tc>
+          <w:tcPr>
+            <w:tcW w:type="dxa" w:w="4320"/>
+          </w:tcPr>
+          <w:p>
+            <w:r>
+              <w:t>Vitest (unit), Playwright (E2E), Testing Library</w:t>
+            </w:r>
+          </w:p>
+        </w:tc>
+      </w:tr>
+      <w:tr>
+        <w:tc>
+          <w:tcPr>
+            <w:tcW w:type="dxa" w:w="4320"/>
+          </w:tcPr>
+          <w:p>
+            <w:r>
+              <w:t>Linting</w:t>
+            </w:r>
+          </w:p>
+        </w:tc>
+        <w:tc>
+          <w:tcPr>
+            <w:tcW w:type="dxa" w:w="4320"/>
+          </w:tcPr>
+          <w:p>
+            <w:r>
+              <w:t>ESLint + Next.js config, Husky pre-commit hooks</w:t>
+            </w:r>
+          </w:p>
+        </w:tc>
+      </w:tr>
+      <w:tr>
+        <w:tc>
+          <w:tcPr>
+            <w:tcW w:type="dxa" w:w="4320"/>
+          </w:tcPr>
+          <w:p>
+            <w:r>
+              <w:t>PWA</w:t>
+            </w:r>
+          </w:p>
+        </w:tc>
+        <w:tc>
+          <w:tcPr>
+            <w:tcW w:type="dxa" w:w="4320"/>
+          </w:tcPr>
+          <w:p>
+            <w:r>
+              <w:t>Web manifest for mobile installability</w:t>
+            </w:r>
+          </w:p>
+        </w:tc>
+      </w:tr>
+    </w:tbl>
+    <w:p/>
+    <w:p>
+      <w:pPr>
+        <w:pStyle w:val="Heading1"/>
+      </w:pPr>
+      <w:r>
+        <w:t>5. Frontend Architecture</w:t>
+      </w:r>
+    </w:p>
+    <w:p>
+      <w:r>
+        <w:t>The frontend is a Next.js 14 application using the App Router with a mix of Server Components (data fetching, auth checks) and Client Components (interactive UI). All authenticated pages live under src/app/(app)/ route group, which shares a common layout with the AppShell (header, sidebar, bottom navigation).</w:t>
+      </w:r>
+    </w:p>
+    <w:p>
+      <w:pPr>
+        <w:pStyle w:val="Heading2"/>
+      </w:pPr>
+      <w:r>
+        <w:t>Key Components (55 total)</w:t>
+      </w:r>
+    </w:p>
+    <w:p>
+      <w:r>
+        <w:rPr>
+          <w:b/>
+        </w:rPr>
+        <w:t xml:space="preserve">AppShell: </w:t>
+      </w:r>
+      <w:r>
+        <w:t>Main wrapper — fixed header with notification bell, profile menu, sidebar navigation. Pure inline styles for z-index reliability.</w:t>
+      </w:r>
+    </w:p>
+    <w:p>
+      <w:r>
+        <w:rPr>
+          <w:b/>
+        </w:rPr>
+        <w:t xml:space="preserve">DashboardView: </w:t>
+      </w:r>
+      <w:r>
+        <w:t>Home dashboard — priority-ordered cards for meds, appointments, labs, claims. Cancer type/stage badges. Treatment cycle tracker. Quick-start cards for empty states.</w:t>
+      </w:r>
+    </w:p>
+    <w:p>
+      <w:r>
+        <w:rPr>
+          <w:b/>
+        </w:rPr>
+        <w:t xml:space="preserve">ChatInterface: </w:t>
+      </w:r>
+      <w:r>
+        <w:t>Full chat UI — message bubbles, streaming responses, tool call indicators, starter prompts, conversation history.</w:t>
+      </w:r>
+    </w:p>
+    <w:p>
+      <w:r>
+        <w:rPr>
+          <w:b/>
+        </w:rPr>
+        <w:t xml:space="preserve">OnboardingWizard: </w:t>
+      </w:r>
+      <w:r>
+        <w:t>4-step wizard with slide animations — patient/caregiver selection, cancer diagnosis, data source, priorities. Google profile pre-fill. Per-step database saving.</w:t>
+      </w:r>
+    </w:p>
+    <w:p>
+      <w:r>
+        <w:rPr>
+          <w:b/>
+        </w:rPr>
+        <w:t xml:space="preserve">TreatmentCycleTracker: </w:t>
+      </w:r>
+      <w:r>
+        <w:t>Visual progress bar parsing "Cycle X of Y" from medication notes. Phase detection (infusion/nadir/recovery). Nadir fever warning.</w:t>
+      </w:r>
+    </w:p>
+    <w:p>
+      <w:r>
+        <w:rPr>
+          <w:b/>
+        </w:rPr>
+        <w:t xml:space="preserve">DocumentScanner: </w:t>
+      </w:r>
+      <w:r>
+        <w:t>Camera/file upload → Claude Vision extraction → structured data import.</w:t>
+      </w:r>
+    </w:p>
+    <w:p>
+      <w:r>
+        <w:rPr>
+          <w:b/>
+        </w:rPr>
+        <w:t xml:space="preserve">NotificationBell: </w:t>
+      </w:r>
+      <w:r>
+        <w:t>Badge count, dropdown panel, per-notification actions (Ask AI, Dismiss).</w:t>
+      </w:r>
+    </w:p>
+    <w:p>
+      <w:r>
+        <w:rPr>
+          <w:b/>
+        </w:rPr>
+        <w:t xml:space="preserve">BottomTabBar: </w:t>
+      </w:r>
+      <w:r>
+        <w:t>Mobile bottom navigation — Home, Chat, Meds, Journal, More.</w:t>
+      </w:r>
+    </w:p>
+    <w:p>
+      <w:pPr>
+        <w:pStyle w:val="Heading2"/>
+      </w:pPr>
+      <w:r>
+        <w:t>Design System</w:t>
+      </w:r>
+    </w:p>
+    <w:p>
+      <w:r>
+        <w:t>Dark theme with purple/lavender accent (gradient: #6366F1 → #A78BFA). Glass-card morphism with subtle borders (rgba(255,255,255,0.06)). CSS custom properties for theming. Ambient animated background. Responsive design with mobile-first approach. Fluid typography (text-fluid-* classes). PWA-ready with manifest.json.</w:t>
+      </w:r>
+    </w:p>
+    <w:p>
+      <w:pPr>
+        <w:pStyle w:val="Heading1"/>
+      </w:pPr>
+      <w:r>
+        <w:t>6. Backend Architecture &amp; API</w:t>
+      </w:r>
+    </w:p>
+    <w:p>
+      <w:r>
+        <w:t>The backend consists of 46 Next.js API routes organized by domain. All routes use Supabase server client for auth and data access. Rate limiting is applied to sensitive endpoints (chat: 20/min, document extraction: 10/min, seed: 5/min).</w:t>
+      </w:r>
+    </w:p>
+    <w:p>
+      <w:pPr>
+        <w:pStyle w:val="Heading2"/>
+      </w:pPr>
+      <w:r>
+        <w:t>API Endpoint Categories</w:t>
+      </w:r>
+    </w:p>
+    <w:p>
+      <w:r>
+        <w:rPr>
+          <w:b/>
+        </w:rPr>
+        <w:t>Chat &amp; AI (3)</w:t>
+        <w:br/>
+      </w:r>
+      <w:r>
+        <w:t>/api/chat — Main streaming chat endpoint with multi-agent orchestration</w:t>
+        <w:br/>
+        <w:t>/api/chat/history — Fetch past messages</w:t>
+        <w:br/>
+        <w:t>/api/health — Health check</w:t>
+      </w:r>
+    </w:p>
+    <w:p>
+      <w:r>
+        <w:rPr>
+          <w:b/>
+        </w:rPr>
+        <w:t>Document Processing (3)</w:t>
+        <w:br/>
+      </w:r>
+      <w:r>
+        <w:t>/api/documents/extract — Unified Claude Vision extraction (rate-limited)</w:t>
+        <w:br/>
+        <w:t>/api/scan-document — Legacy scan endpoint</w:t>
+        <w:br/>
+        <w:t>/api/save-scan-results — Persist extraction results</w:t>
+      </w:r>
+    </w:p>
+    <w:p>
+      <w:r>
+        <w:rPr>
+          <w:b/>
+        </w:rPr>
+        <w:t>OAuth &amp; Integrations (12)</w:t>
+        <w:br/>
+      </w:r>
+      <w:r>
+        <w:t>Walgreens, Google Calendar, Health System, Insurance, FHIR, 1upHealth — each with authorize + callback routes</w:t>
+      </w:r>
+    </w:p>
+    <w:p>
+      <w:r>
+        <w:rPr>
+          <w:b/>
+        </w:rPr>
+        <w:t>Data Sync (7)</w:t>
+        <w:br/>
+      </w:r>
+      <w:r>
+        <w:t>/api/sync/all, /api/sync/google-calendar, /api/sync/health-system, /api/sync/insurance, /api/fhir/sync, /api/oneup/sync, /api/cron/sync</w:t>
+      </w:r>
+    </w:p>
+    <w:p>
+      <w:r>
+        <w:rPr>
+          <w:b/>
+        </w:rPr>
+        <w:t>Care Team (4)</w:t>
+        <w:br/>
+      </w:r>
+      <w:r>
+        <w:t>/api/care-team — List, /api/care-team/invite, /api/care-team/accept, /api/care-team/remove</w:t>
+      </w:r>
+    </w:p>
+    <w:p>
+      <w:r>
+        <w:rPr>
+          <w:b/>
+        </w:rPr>
+        <w:t>Notifications &amp; Reminders (5)</w:t>
+        <w:br/>
+      </w:r>
+      <w:r>
+        <w:t>/api/notifications/generate (cron), /api/notifications/read, /api/reminders, /api/reminders/check (cron), /api/reminders/respond</w:t>
+      </w:r>
+    </w:p>
+    <w:p>
+      <w:r>
+        <w:rPr>
+          <w:b/>
+        </w:rPr>
+        <w:t>Data Management (7)</w:t>
+        <w:br/>
+      </w:r>
+      <w:r>
+        <w:t>/api/journal, /api/health-summary, /api/visit-prep, /api/profile-switch, /api/share, /api/export-data, /api/delete-account</w:t>
+      </w:r>
+    </w:p>
+    <w:p>
+      <w:r>
+        <w:rPr>
+          <w:b/>
+        </w:rPr>
+        <w:t>Utilities (5)</w:t>
+        <w:br/>
+      </w:r>
+      <w:r>
+        <w:t>/api/welcome-email, /api/import-medications, /api/extract-medications, /api/seed-demo, /api/cron/sync</w:t>
+      </w:r>
+    </w:p>
+    <w:p>
+      <w:pPr>
+        <w:pStyle w:val="Heading1"/>
+      </w:pPr>
+      <w:r>
+        <w:t>7. AI System</w:t>
+      </w:r>
+    </w:p>
+    <w:p>
+      <w:pPr>
+        <w:pStyle w:val="Heading2"/>
+      </w:pPr>
+      <w:r>
+        <w:t>Multi-Agent Architecture</w:t>
+      </w:r>
+    </w:p>
+    <w:p>
+      <w:r>
+        <w:t>CareCompanion uses a multi-agent orchestration system where incoming messages are classified by a routing agent (Claude Haiku) and dispatched to 1-6 specialist agents that run in parallel. Their outputs are synthesized into a single response.</w:t>
+      </w:r>
+    </w:p>
+    <w:p>
+      <w:r>
+        <w:rPr>
+          <w:b/>
+        </w:rPr>
+        <w:t xml:space="preserve">Message Router (Haiku): </w:t>
+      </w:r>
+      <w:r>
+        <w:t>Classifies incoming message, routes to specialists, detects complexity</w:t>
+      </w:r>
+    </w:p>
+    <w:p>
+      <w:r>
+        <w:rPr>
+          <w:b/>
+        </w:rPr>
+        <w:t xml:space="preserve">Medication Specialist 💊: </w:t>
+      </w:r>
+      <w:r>
+        <w:t>Drug interactions, dosing, refills, pharmacy, CYP450 pathway analysis</w:t>
+      </w:r>
+    </w:p>
+    <w:p>
+      <w:r>
+        <w:rPr>
+          <w:b/>
+        </w:rPr>
+        <w:t xml:space="preserve">Insurance Navigator 💰: </w:t>
+      </w:r>
+      <w:r>
+        <w:t>Claims, denials, appeals, prior auths, cost estimation, FSA/HSA</w:t>
+      </w:r>
+    </w:p>
+    <w:p>
+      <w:r>
+        <w:rPr>
+          <w:b/>
+        </w:rPr>
+        <w:t xml:space="preserve">Scheduling Coordinator 📅: </w:t>
+      </w:r>
+      <w:r>
+        <w:t>Appointments, visit prep, follow-ups, calendar management</w:t>
+      </w:r>
+    </w:p>
+    <w:p>
+      <w:r>
+        <w:rPr>
+          <w:b/>
+        </w:rPr>
+        <w:t xml:space="preserve">Wellness Monitor 🧘: </w:t>
+      </w:r>
+      <w:r>
+        <w:t>Symptoms, caregiver burnout, emotional health, coping strategies</w:t>
+      </w:r>
+    </w:p>
+    <w:p>
+      <w:r>
+        <w:rPr>
+          <w:b/>
+        </w:rPr>
+        <w:t xml:space="preserve">Lab Analyst 🔬: </w:t>
+      </w:r>
+      <w:r>
+        <w:t>Result interpretation, trends, abnormal flagging, tumor markers</w:t>
+      </w:r>
+    </w:p>
+    <w:p>
+      <w:r>
+        <w:rPr>
+          <w:b/>
+        </w:rPr>
+        <w:t xml:space="preserve">General Companion 👥: </w:t>
+      </w:r>
+      <w:r>
+        <w:t>Profile management, document analysis, general questions</w:t>
+      </w:r>
+    </w:p>
+    <w:p>
+      <w:pPr>
+        <w:pStyle w:val="Heading2"/>
+      </w:pPr>
+      <w:r>
+        <w:t>System Prompt (16KB+)</w:t>
+      </w:r>
+    </w:p>
+    <w:p>
+      <w:r>
+        <w:t>The system prompt is cancer-specific and includes:</w:t>
+        <w:br/>
+        <w:t>• Safety rules: No diagnoses, no med changes, emergency protocols (Call 911 first)</w:t>
+        <w:br/>
+        <w:t>• Drug interaction checking with CYP450 pathway analysis and severity classification</w:t>
+        <w:br/>
+        <w:t>• Lab interpretation: CBC, tumor markers (CEA, CA-125, PSA), kidney/liver function</w:t>
+        <w:br/>
+        <w:t>• Chemo regimen knowledge: FOLFOX, FOLFIRI, AC-T, R-CHOP, ABVD, carboplatin/paclitaxel</w:t>
+        <w:br/>
+        <w:t>• Oncology drug knowledge: checkpoint inhibitors, targeted therapies, hormonal therapies, supportive meds</w:t>
+        <w:br/>
+        <w:t>• Treatment cycle awareness: nadir timing, side effect patterns per cycle phase</w:t>
+        <w:br/>
+        <w:t>• Insurance navigation: denial codes, appeal steps, cost estimation</w:t>
+        <w:br/>
+        <w:t>• Caregiver support: burnout recognition, emotional wellbeing, support resources</w:t>
+        <w:br/>
+        <w:t>• Personalized greeting based on cancer type and treatment phase</w:t>
+      </w:r>
+    </w:p>
+    <w:p>
+      <w:pPr>
+        <w:pStyle w:val="Heading2"/>
+      </w:pPr>
+      <w:r>
+        <w:t>16 Callable Tools</w:t>
+      </w:r>
+    </w:p>
+    <w:p>
+      <w:pPr>
+        <w:pStyle w:val="ListBullet"/>
+      </w:pPr>
+      <w:r>
+        <w:t>save_medication</w:t>
+      </w:r>
+    </w:p>
+    <w:p>
+      <w:pPr>
+        <w:pStyle w:val="ListBullet"/>
+      </w:pPr>
+      <w:r>
+        <w:t>update_medication</w:t>
+      </w:r>
+    </w:p>
+    <w:p>
+      <w:pPr>
+        <w:pStyle w:val="ListBullet"/>
+      </w:pPr>
+      <w:r>
+        <w:t>save_doctor</w:t>
+      </w:r>
+    </w:p>
+    <w:p>
+      <w:pPr>
+        <w:pStyle w:val="ListBullet"/>
+      </w:pPr>
+      <w:r>
+        <w:t>save_appointment</w:t>
+      </w:r>
+    </w:p>
+    <w:p>
+      <w:pPr>
+        <w:pStyle w:val="ListBullet"/>
+      </w:pPr>
+      <w:r>
+        <w:t>save_lab_result</w:t>
+      </w:r>
+    </w:p>
+    <w:p>
+      <w:pPr>
+        <w:pStyle w:val="ListBullet"/>
+      </w:pPr>
+      <w:r>
+        <w:t>save_symptom</w:t>
+      </w:r>
+    </w:p>
+    <w:p>
+      <w:pPr>
+        <w:pStyle w:val="ListBullet"/>
+      </w:pPr>
+      <w:r>
+        <w:t>save_insurance</w:t>
+      </w:r>
+    </w:p>
+    <w:p>
+      <w:pPr>
+        <w:pStyle w:val="ListBullet"/>
+      </w:pPr>
+      <w:r>
+        <w:t>save_claim</w:t>
+      </w:r>
+    </w:p>
+    <w:p>
+      <w:pPr>
+        <w:pStyle w:val="ListBullet"/>
+      </w:pPr>
+      <w:r>
+        <w:t>estimate_costs</w:t>
+      </w:r>
+    </w:p>
+    <w:p>
+      <w:pPr>
+        <w:pStyle w:val="ListBullet"/>
+      </w:pPr>
+      <w:r>
+        <w:t>create_reminder</w:t>
+      </w:r>
+    </w:p>
+    <w:p>
+      <w:pPr>
+        <w:pStyle w:val="ListBullet"/>
+      </w:pPr>
+      <w:r>
+        <w:t>save_memory</w:t>
+      </w:r>
+    </w:p>
+    <w:p>
+      <w:pPr>
+        <w:pStyle w:val="ListBullet"/>
+      </w:pPr>
+      <w:r>
+        <w:t>search_memories</w:t>
+      </w:r>
+    </w:p>
+    <w:p>
+      <w:pPr>
+        <w:pStyle w:val="ListBullet"/>
+      </w:pPr>
+      <w:r>
+        <w:t>generate_visit_prep</w:t>
+      </w:r>
+    </w:p>
+    <w:p>
+      <w:pPr>
+        <w:pStyle w:val="ListBullet"/>
+      </w:pPr>
+      <w:r>
+        <w:t>query_lab_trends</w:t>
+      </w:r>
+    </w:p>
+    <w:p>
+      <w:pPr>
+        <w:pStyle w:val="ListBullet"/>
+      </w:pPr>
+      <w:r>
+        <w:t>check_med_interactions</w:t>
+      </w:r>
+    </w:p>
+    <w:p>
+      <w:pPr>
+        <w:pStyle w:val="ListBullet"/>
+      </w:pPr>
+      <w:r>
+        <w:t>save_note</w:t>
+      </w:r>
+    </w:p>
+    <w:p>
+      <w:pPr>
+        <w:pStyle w:val="Heading2"/>
+      </w:pPr>
+      <w:r>
+        <w:t>Long-Term Memory System</w:t>
+      </w:r>
+    </w:p>
+    <w:p>
+      <w:r>
+        <w:t>After every assistant response, an async process (Claude Haiku) extracts key facts from the conversation and stores them in the memories table. Facts are categorized (medication, condition, allergy, etc.), confidence-scored (high/medium/low), and deduplicated within a 1-hour window. All memories are loaded into chat context for every subsequent message. Every 20 messages, a conversation summary is generated.</w:t>
+      </w:r>
+    </w:p>
+    <w:p>
+      <w:pPr>
+        <w:pStyle w:val="Heading1"/>
+      </w:pPr>
+      <w:r>
+        <w:t>8. Database Schema</w:t>
+      </w:r>
+    </w:p>
+    <w:p>
+      <w:r>
+        <w:t>Supabase PostgreSQL with Row-Level Security on all tables. 23 tables total.</w:t>
+      </w:r>
+    </w:p>
+    <w:tbl>
+      <w:tblPr>
+        <w:tblStyle w:val="LightGrid-Accent1"/>
+        <w:tblW w:type="auto" w:w="0"/>
+        <w:tblLook w:firstColumn="1" w:firstRow="1" w:lastColumn="0" w:lastRow="0" w:noHBand="0" w:noVBand="1" w:val="04A0"/>
+      </w:tblPr>
+      <w:tblGrid>
+        <w:gridCol w:w="4320"/>
+        <w:gridCol w:w="4320"/>
+      </w:tblGrid>
+      <w:tr>
+        <w:tc>
+          <w:tcPr>
+            <w:tcW w:type="dxa" w:w="4320"/>
+          </w:tcPr>
+          <w:p>
+            <w:r>
               <w:t>Table</w:t>
             </w:r>
           </w:p>
@@ -1391,10 +1959,7 @@
           </w:tcPr>
           <w:p>
             <w:r>
-              <w:rPr>
-                <w:b/>
-              </w:rPr>
-              <w:t>What It Holds</w:t>
+              <w:t>Purpose</w:t>
             </w:r>
           </w:p>
         </w:tc>
@@ -1416,7 +1981,7 @@
           </w:tcPr>
           <w:p>
             <w:r>
-              <w:t>Patient info — name, age, relationship, conditions, allergies</w:t>
+              <w:t>Patient info, cancer type/stage, treatment phase, onboarding state</w:t>
             </w:r>
           </w:p>
         </w:tc>
@@ -1438,7 +2003,7 @@
           </w:tcPr>
           <w:p>
             <w:r>
-              <w:t>Drug name, dose, how often, refill date</w:t>
+              <w:t>Name, dose, frequency, prescribing doctor, refill date, quantity</w:t>
             </w:r>
           </w:p>
         </w:tc>
@@ -1482,7 +2047,7 @@
           </w:tcPr>
           <w:p>
             <w:r>
-              <w:t>Date/time, doctor, purpose, prep notes, follow-up notes</w:t>
+              <w:t>Doctor, date/time, location, purpose, prep notes, follow-up notes</w:t>
             </w:r>
           </w:p>
         </w:tc>
@@ -1504,7 +2069,7 @@
           </w:tcPr>
           <w:p>
             <w:r>
-              <w:t>Uploaded medical documents</w:t>
+              <w:t>Uploaded document metadata (type, URL, description)</w:t>
             </w:r>
           </w:p>
         </w:tc>
@@ -1526,7 +2091,51 @@
           </w:tcPr>
           <w:p>
             <w:r>
-              <w:t>Full chat history (every message sent and received)</w:t>
+              <w:t>Chat history (user/assistant messages)</w:t>
+            </w:r>
+          </w:p>
+        </w:tc>
+      </w:tr>
+      <w:tr>
+        <w:tc>
+          <w:tcPr>
+            <w:tcW w:type="dxa" w:w="4320"/>
+          </w:tcPr>
+          <w:p>
+            <w:r>
+              <w:t>memories</w:t>
+            </w:r>
+          </w:p>
+        </w:tc>
+        <w:tc>
+          <w:tcPr>
+            <w:tcW w:type="dxa" w:w="4320"/>
+          </w:tcPr>
+          <w:p>
+            <w:r>
+              <w:t>Long-term facts extracted from conversations (13 categories)</w:t>
+            </w:r>
+          </w:p>
+        </w:tc>
+      </w:tr>
+      <w:tr>
+        <w:tc>
+          <w:tcPr>
+            <w:tcW w:type="dxa" w:w="4320"/>
+          </w:tcPr>
+          <w:p>
+            <w:r>
+              <w:t>notifications</w:t>
+            </w:r>
+          </w:p>
+        </w:tc>
+        <w:tc>
+          <w:tcPr>
+            <w:tcW w:type="dxa" w:w="4320"/>
+          </w:tcPr>
+          <w:p>
+            <w:r>
+              <w:t>Proactive alerts (refill, appointment, lab, claim)</w:t>
             </w:r>
           </w:p>
         </w:tc>
@@ -1548,7 +2157,51 @@
           </w:tcPr>
           <w:p>
             <w:r>
-              <w:t>Test name, value, normal range, whether it's abnormal, date</w:t>
+              <w:t>Test name, value, unit, reference range, abnormal flag</w:t>
+            </w:r>
+          </w:p>
+        </w:tc>
+      </w:tr>
+      <w:tr>
+        <w:tc>
+          <w:tcPr>
+            <w:tcW w:type="dxa" w:w="4320"/>
+          </w:tcPr>
+          <w:p>
+            <w:r>
+              <w:t>claims</w:t>
+            </w:r>
+          </w:p>
+        </w:tc>
+        <w:tc>
+          <w:tcPr>
+            <w:tcW w:type="dxa" w:w="4320"/>
+          </w:tcPr>
+          <w:p>
+            <w:r>
+              <w:t>Insurance claims (billed, paid, patient responsibility, status)</w:t>
+            </w:r>
+          </w:p>
+        </w:tc>
+      </w:tr>
+      <w:tr>
+        <w:tc>
+          <w:tcPr>
+            <w:tcW w:type="dxa" w:w="4320"/>
+          </w:tcPr>
+          <w:p>
+            <w:r>
+              <w:t>prior_auths</w:t>
+            </w:r>
+          </w:p>
+        </w:tc>
+        <w:tc>
+          <w:tcPr>
+            <w:tcW w:type="dxa" w:w="4320"/>
+          </w:tcPr>
+          <w:p>
+            <w:r>
+              <w:t>Prior authorizations (service, status, sessions used/approved)</w:t>
             </w:r>
           </w:p>
         </w:tc>
@@ -1570,51 +2223,7 @@
           </w:tcPr>
           <w:p>
             <w:r>
-              <w:t>Plan details — provider, member ID, deductible, out-of-pocket limits</w:t>
-            </w:r>
-          </w:p>
-        </w:tc>
-      </w:tr>
-      <w:tr>
-        <w:tc>
-          <w:tcPr>
-            <w:tcW w:type="dxa" w:w="4320"/>
-          </w:tcPr>
-          <w:p>
-            <w:r>
-              <w:t>claims</w:t>
-            </w:r>
-          </w:p>
-        </w:tc>
-        <w:tc>
-          <w:tcPr>
-            <w:tcW w:type="dxa" w:w="4320"/>
-          </w:tcPr>
-          <w:p>
-            <w:r>
-              <w:t>Insurance claims — provider, amount, status, denial reason</w:t>
-            </w:r>
-          </w:p>
-        </w:tc>
-      </w:tr>
-      <w:tr>
-        <w:tc>
-          <w:tcPr>
-            <w:tcW w:type="dxa" w:w="4320"/>
-          </w:tcPr>
-          <w:p>
-            <w:r>
-              <w:t>prior_auths</w:t>
-            </w:r>
-          </w:p>
-        </w:tc>
-        <w:tc>
-          <w:tcPr>
-            <w:tcW w:type="dxa" w:w="4320"/>
-          </w:tcPr>
-          <w:p>
-            <w:r>
-              <w:t>Pre-approvals — service type, expiry date, sessions used vs approved</w:t>
+              <w:t>Insurance provider, member ID, deductible/OOP tracking</w:t>
             </w:r>
           </w:p>
         </w:tc>
@@ -1636,7 +2245,7 @@
           </w:tcPr>
           <w:p>
             <w:r>
-              <w:t>Flexible spending / health savings account balances</w:t>
+              <w:t>FSA/HSA balance, contribution limits</w:t>
             </w:r>
           </w:p>
         </w:tc>
@@ -1658,7 +2267,7 @@
           </w:tcPr>
           <w:p>
             <w:r>
-              <w:t>Login tokens for connected hospital systems and services</w:t>
+              <w:t>OAuth tokens for integrated services</w:t>
             </w:r>
           </w:p>
         </w:tc>
@@ -1670,7 +2279,7 @@
           </w:tcPr>
           <w:p>
             <w:r>
-              <w:t>memories</w:t>
+              <w:t>medication_reminders</w:t>
             </w:r>
           </w:p>
         </w:tc>
@@ -1680,7 +2289,161 @@
           </w:tcPr>
           <w:p>
             <w:r>
-              <w:t>Facts the AI has learned from conversations</w:t>
+              <w:t>Reminder schedules (times, days, active status)</w:t>
+            </w:r>
+          </w:p>
+        </w:tc>
+      </w:tr>
+      <w:tr>
+        <w:tc>
+          <w:tcPr>
+            <w:tcW w:type="dxa" w:w="4320"/>
+          </w:tcPr>
+          <w:p>
+            <w:r>
+              <w:t>reminder_logs</w:t>
+            </w:r>
+          </w:p>
+        </w:tc>
+        <w:tc>
+          <w:tcPr>
+            <w:tcW w:type="dxa" w:w="4320"/>
+          </w:tcPr>
+          <w:p>
+            <w:r>
+              <w:t>Adherence tracking (taken/snoozed/missed)</w:t>
+            </w:r>
+          </w:p>
+        </w:tc>
+      </w:tr>
+      <w:tr>
+        <w:tc>
+          <w:tcPr>
+            <w:tcW w:type="dxa" w:w="4320"/>
+          </w:tcPr>
+          <w:p>
+            <w:r>
+              <w:t>symptom_entries</w:t>
+            </w:r>
+          </w:p>
+        </w:tc>
+        <w:tc>
+          <w:tcPr>
+            <w:tcW w:type="dxa" w:w="4320"/>
+          </w:tcPr>
+          <w:p>
+            <w:r>
+              <w:t>Daily journal (pain, mood, sleep, appetite, energy, symptoms)</w:t>
+            </w:r>
+          </w:p>
+        </w:tc>
+      </w:tr>
+      <w:tr>
+        <w:tc>
+          <w:tcPr>
+            <w:tcW w:type="dxa" w:w="4320"/>
+          </w:tcPr>
+          <w:p>
+            <w:r>
+              <w:t>care_team_members</w:t>
+            </w:r>
+          </w:p>
+        </w:tc>
+        <w:tc>
+          <w:tcPr>
+            <w:tcW w:type="dxa" w:w="4320"/>
+          </w:tcPr>
+          <w:p>
+            <w:r>
+              <w:t>Team members with roles (owner/editor/viewer)</w:t>
+            </w:r>
+          </w:p>
+        </w:tc>
+      </w:tr>
+      <w:tr>
+        <w:tc>
+          <w:tcPr>
+            <w:tcW w:type="dxa" w:w="4320"/>
+          </w:tcPr>
+          <w:p>
+            <w:r>
+              <w:t>care_team_invites</w:t>
+            </w:r>
+          </w:p>
+        </w:tc>
+        <w:tc>
+          <w:tcPr>
+            <w:tcW w:type="dxa" w:w="4320"/>
+          </w:tcPr>
+          <w:p>
+            <w:r>
+              <w:t>Pending invitations</w:t>
+            </w:r>
+          </w:p>
+        </w:tc>
+      </w:tr>
+      <w:tr>
+        <w:tc>
+          <w:tcPr>
+            <w:tcW w:type="dxa" w:w="4320"/>
+          </w:tcPr>
+          <w:p>
+            <w:r>
+              <w:t>care_team_activity</w:t>
+            </w:r>
+          </w:p>
+        </w:tc>
+        <w:tc>
+          <w:tcPr>
+            <w:tcW w:type="dxa" w:w="4320"/>
+          </w:tcPr>
+          <w:p>
+            <w:r>
+              <w:t>Audit log of team actions</w:t>
+            </w:r>
+          </w:p>
+        </w:tc>
+      </w:tr>
+      <w:tr>
+        <w:tc>
+          <w:tcPr>
+            <w:tcW w:type="dxa" w:w="4320"/>
+          </w:tcPr>
+          <w:p>
+            <w:r>
+              <w:t>user_settings</w:t>
+            </w:r>
+          </w:p>
+        </w:tc>
+        <w:tc>
+          <w:tcPr>
+            <w:tcW w:type="dxa" w:w="4320"/>
+          </w:tcPr>
+          <w:p>
+            <w:r>
+              <w:t>Notification preferences, AI personality</w:t>
+            </w:r>
+          </w:p>
+        </w:tc>
+      </w:tr>
+      <w:tr>
+        <w:tc>
+          <w:tcPr>
+            <w:tcW w:type="dxa" w:w="4320"/>
+          </w:tcPr>
+          <w:p>
+            <w:r>
+              <w:t>user_preferences</w:t>
+            </w:r>
+          </w:p>
+        </w:tc>
+        <w:tc>
+          <w:tcPr>
+            <w:tcW w:type="dxa" w:w="4320"/>
+          </w:tcPr>
+          <w:p>
+            <w:r>
+              <w:t>Active profile selection (multi-patient)</w:t>
             </w:r>
           </w:p>
         </w:tc>
@@ -1702,194 +2465,270 @@
           </w:tcPr>
           <w:p>
             <w:r>
-              <w:t>Digests of past conversations</w:t>
-            </w:r>
-          </w:p>
-        </w:tc>
-      </w:tr>
-      <w:tr>
-        <w:tc>
-          <w:tcPr>
-            <w:tcW w:type="dxa" w:w="4320"/>
-          </w:tcPr>
-          <w:p>
-            <w:r>
-              <w:t>notifications</w:t>
-            </w:r>
-          </w:p>
-        </w:tc>
-        <w:tc>
-          <w:tcPr>
-            <w:tcW w:type="dxa" w:w="4320"/>
-          </w:tcPr>
-          <w:p>
-            <w:r>
-              <w:t>Alerts (refill due, appointment tomorrow, abnormal lab, etc.)</w:t>
-            </w:r>
-          </w:p>
-        </w:tc>
-      </w:tr>
-      <w:tr>
-        <w:tc>
-          <w:tcPr>
-            <w:tcW w:type="dxa" w:w="4320"/>
-          </w:tcPr>
-          <w:p>
-            <w:r>
-              <w:t>medication_reminders</w:t>
-            </w:r>
-          </w:p>
-        </w:tc>
-        <w:tc>
-          <w:tcPr>
-            <w:tcW w:type="dxa" w:w="4320"/>
-          </w:tcPr>
-          <w:p>
-            <w:r>
-              <w:t>Scheduled reminder times for each medication</w:t>
-            </w:r>
-          </w:p>
-        </w:tc>
-      </w:tr>
-      <w:tr>
-        <w:tc>
-          <w:tcPr>
-            <w:tcW w:type="dxa" w:w="4320"/>
-          </w:tcPr>
-          <w:p>
-            <w:r>
-              <w:t>reminder_logs</w:t>
-            </w:r>
-          </w:p>
-        </w:tc>
-        <w:tc>
-          <w:tcPr>
-            <w:tcW w:type="dxa" w:w="4320"/>
-          </w:tcPr>
-          <w:p>
-            <w:r>
-              <w:t>Whether each reminder was taken, snoozed, or missed</w:t>
-            </w:r>
-          </w:p>
-        </w:tc>
-      </w:tr>
-      <w:tr>
-        <w:tc>
-          <w:tcPr>
-            <w:tcW w:type="dxa" w:w="4320"/>
-          </w:tcPr>
-          <w:p>
-            <w:r>
-              <w:t>symptom_entries</w:t>
-            </w:r>
-          </w:p>
-        </w:tc>
-        <w:tc>
-          <w:tcPr>
-            <w:tcW w:type="dxa" w:w="4320"/>
-          </w:tcPr>
-          <w:p>
-            <w:r>
-              <w:t>Daily journal entries (pain, mood, sleep, energy, symptoms)</w:t>
-            </w:r>
-          </w:p>
-        </w:tc>
-      </w:tr>
-      <w:tr>
-        <w:tc>
-          <w:tcPr>
-            <w:tcW w:type="dxa" w:w="4320"/>
-          </w:tcPr>
-          <w:p>
-            <w:r>
-              <w:t>care_team_members</w:t>
-            </w:r>
-          </w:p>
-        </w:tc>
-        <w:tc>
-          <w:tcPr>
-            <w:tcW w:type="dxa" w:w="4320"/>
-          </w:tcPr>
-          <w:p>
-            <w:r>
-              <w:t>Who has access to which patient profile and their role</w:t>
-            </w:r>
-          </w:p>
-        </w:tc>
-      </w:tr>
-      <w:tr>
-        <w:tc>
-          <w:tcPr>
-            <w:tcW w:type="dxa" w:w="4320"/>
-          </w:tcPr>
-          <w:p>
-            <w:r>
-              <w:t>care_team_invites</w:t>
-            </w:r>
-          </w:p>
-        </w:tc>
-        <w:tc>
-          <w:tcPr>
-            <w:tcW w:type="dxa" w:w="4320"/>
-          </w:tcPr>
-          <w:p>
-            <w:r>
-              <w:t>Pending email invitations to join a care team</w:t>
-            </w:r>
-          </w:p>
-        </w:tc>
-      </w:tr>
-      <w:tr>
-        <w:tc>
-          <w:tcPr>
-            <w:tcW w:type="dxa" w:w="4320"/>
-          </w:tcPr>
-          <w:p>
-            <w:r>
-              <w:t>care_team_activity</w:t>
-            </w:r>
-          </w:p>
-        </w:tc>
-        <w:tc>
-          <w:tcPr>
-            <w:tcW w:type="dxa" w:w="4320"/>
-          </w:tcPr>
-          <w:p>
-            <w:r>
-              <w:t>Activity feed of actions taken by team members</w:t>
-            </w:r>
-          </w:p>
-        </w:tc>
-      </w:tr>
-      <w:tr>
-        <w:tc>
-          <w:tcPr>
-            <w:tcW w:type="dxa" w:w="4320"/>
-          </w:tcPr>
-          <w:p>
-            <w:r>
-              <w:t>user_preferences</w:t>
-            </w:r>
-          </w:p>
-        </w:tc>
-        <w:tc>
-          <w:tcPr>
-            <w:tcW w:type="dxa" w:w="4320"/>
-          </w:tcPr>
-          <w:p>
-            <w:r>
-              <w:t>Settings like which patient profile is currently active</w:t>
+              <w:t>Periodic chat summaries with topics</w:t>
             </w:r>
           </w:p>
         </w:tc>
       </w:tr>
     </w:tbl>
+    <w:p/>
     <w:p>
       <w:pPr>
         <w:pStyle w:val="Heading1"/>
       </w:pPr>
       <w:r>
-        <w:t>What's Planned But Not Built Yet</w:t>
+        <w:t>9. Authentication &amp; Security</w:t>
+      </w:r>
+    </w:p>
+    <w:p>
+      <w:r>
+        <w:t>Authentication: Supabase Auth with Google OAuth and email/password. Middleware protects all app routes — unauthenticated users redirect to /login. Auth callback at /auth/callback handles OAuth code exchange and routes new users to onboarding, returning users to dashboard.</w:t>
+        <w:br/>
+        <w:br/>
+        <w:t>Security measures:</w:t>
+        <w:br/>
+        <w:t>• Row-Level Security (RLS) on all Supabase tables — users can only access their own data</w:t>
+        <w:br/>
+        <w:t>• Rate limiting on sensitive API endpoints (in-memory token bucket)</w:t>
+        <w:br/>
+        <w:t>• Input validation via Zod schemas on document extraction</w:t>
+        <w:br/>
+        <w:t>• CSRF protection via Supabase auth cookies</w:t>
+        <w:br/>
+        <w:t>• No hardcoded secrets — all credentials in environment variables</w:t>
+        <w:br/>
+        <w:t>• Pre-push build hook prevents deploying broken code</w:t>
+        <w:br/>
+        <w:t>• AI safety rules prevent diagnosis and medication recommendations</w:t>
+      </w:r>
+    </w:p>
+    <w:p>
+      <w:pPr>
+        <w:pStyle w:val="Heading1"/>
+      </w:pPr>
+      <w:r>
+        <w:t>10. Health Data Integrations</w:t>
+      </w:r>
+    </w:p>
+    <w:p>
+      <w:r>
+        <w:rPr>
+          <w:b/>
+        </w:rPr>
+        <w:t xml:space="preserve">Epic MyChart (FHIR): </w:t>
+      </w:r>
+      <w:r>
+        <w:t>Direct SMART on FHIR OAuth. Covers ~60% of US hospitals (Mayo, Johns Hopkins, Cleveland Clinic). Syncs allergies, conditions, medications, labs, appointments. Currently in sandbox — production approval pending.</w:t>
+      </w:r>
+    </w:p>
+    <w:p>
+      <w:r>
+        <w:rPr>
+          <w:b/>
+        </w:rPr>
+        <w:t xml:space="preserve">Cerner/Oracle Health: </w:t>
+      </w:r>
+      <w:r>
+        <w:t>FHIR integration covering ~25% of US hospitals including VA system. PKCE support for secure auth.</w:t>
+      </w:r>
+    </w:p>
+    <w:p>
+      <w:r>
+        <w:rPr>
+          <w:b/>
+        </w:rPr>
+        <w:t xml:space="preserve">1upHealth Aggregator: </w:t>
+      </w:r>
+      <w:r>
+        <w:t>Connects to 500+ health systems at once. Planned as primary aggregation layer. Approval pending.</w:t>
+      </w:r>
+    </w:p>
+    <w:p>
+      <w:r>
+        <w:rPr>
+          <w:b/>
+        </w:rPr>
+        <w:t xml:space="preserve">Medicare Blue Button: </w:t>
+      </w:r>
+      <w:r>
+        <w:t>Direct API for Medicare beneficiaries. Claims, EOBs, coverage data. Registration pending.</w:t>
+      </w:r>
+    </w:p>
+    <w:p>
+      <w:r>
+        <w:rPr>
+          <w:b/>
+        </w:rPr>
+        <w:t xml:space="preserve">Walgreens: </w:t>
+      </w:r>
+      <w:r>
+        <w:t>Prescription sync, refill dates, pickup alerts. Developer API integration built. Partnership approval pending.</w:t>
+      </w:r>
+    </w:p>
+    <w:p>
+      <w:r>
+        <w:rPr>
+          <w:b/>
+        </w:rPr>
+        <w:t xml:space="preserve">Google Calendar: </w:t>
+      </w:r>
+      <w:r>
+        <w:t>OAuth integration for appointment sync. Route built, sync logic pending.</w:t>
+      </w:r>
+    </w:p>
+    <w:p>
+      <w:pPr>
+        <w:pStyle w:val="Heading2"/>
+      </w:pPr>
+      <w:r>
+        <w:t>Sync Schedule (Vercel Cron)</w:t>
+      </w:r>
+    </w:p>
+    <w:p>
+      <w:r>
+        <w:t>• 6:00 AM UTC — Internal sync (/api/cron/sync)</w:t>
+        <w:br/>
+        <w:t>• 8:00 AM UTC — All connected accounts (/api/sync/all)</w:t>
+        <w:br/>
+        <w:t>• 9:00 AM UTC — Proactive notifications (/api/notifications/generate)</w:t>
+        <w:br/>
+        <w:t>• 10:00 AM UTC — Medication reminders (/api/reminders/check)</w:t>
+      </w:r>
+    </w:p>
+    <w:p>
+      <w:pPr>
+        <w:pStyle w:val="Heading1"/>
+      </w:pPr>
+      <w:r>
+        <w:t>11. Notification Engine</w:t>
+      </w:r>
+    </w:p>
+    <w:p>
+      <w:r>
+        <w:t>Proactive alerts generated daily (respects user toggle settings):</w:t>
+        <w:br/>
+        <w:t>• Medication refills due within 3 days</w:t>
+        <w:br/>
+        <w:t>• Appointments tomorrow (8am alert)</w:t>
+        <w:br/>
+        <w:t>• Prior authorizations expiring within 7 days</w:t>
+        <w:br/>
+        <w:t>• New abnormal lab results flagged</w:t>
+        <w:br/>
+        <w:t>• FSA/HSA balance below threshold</w:t>
+        <w:br/>
+        <w:br/>
+        <w:t>Each notification has an "Ask AI" action that opens the chat with a pre-populated prompt relevant to that notification. Deduplication prevents repeat alerts within 24 hours.</w:t>
+      </w:r>
+    </w:p>
+    <w:p>
+      <w:pPr>
+        <w:pStyle w:val="Heading1"/>
+      </w:pPr>
+      <w:r>
+        <w:t>12. Onboarding Flow</w:t>
+      </w:r>
+    </w:p>
+    <w:p>
+      <w:r>
+        <w:t>New users go through a 4-step onboarding wizard with slide animations:</w:t>
+        <w:br/>
+        <w:br/>
+        <w:t>Step 0 (Intro): App branding animation with feature highlights</w:t>
+        <w:br/>
+        <w:t>Step 1 (Welcome): Patient vs caregiver selection. Google profile pre-fill. Skip option.</w:t>
+        <w:br/>
+        <w:t>Step 2 (Diagnosis): Cancer type (tappable pill grid), stage (I-IV buttons), treatment phase.</w:t>
+        <w:br/>
+        <w:t>Step 3 (Data Source): Connect health records, scan documents, enter manually, or try demo.</w:t>
+        <w:br/>
+        <w:t>Step 4 (Priorities): Pick up to 3 priorities that shape dashboard card ordering and notifications.</w:t>
+        <w:br/>
+        <w:br/>
+        <w:t>Progress is saved per-step to the database (survives page refresh). Existing users who haven't completed onboarding see a "Complete your profile" banner on the dashboard. Settings page has "Edit Profile &amp; Preferences" to re-do onboarding.</w:t>
+      </w:r>
+    </w:p>
+    <w:p>
+      <w:pPr>
+        <w:pStyle w:val="Heading1"/>
+      </w:pPr>
+      <w:r>
+        <w:t>13. Multi-Patient Support</w:t>
+      </w:r>
+    </w:p>
+    <w:p>
+      <w:r>
+        <w:t>Users can manage multiple care profiles (e.g., managing both parents). A profile switcher in the header allows toggling between patients. All data queries are filtered by the active profile ID. Care team members can be invited with role-based permissions (owner/editor/viewer). Activity logs track all changes per profile.</w:t>
+      </w:r>
+    </w:p>
+    <w:p>
+      <w:pPr>
+        <w:pStyle w:val="Heading1"/>
+      </w:pPr>
+      <w:r>
+        <w:t>14. Deployment &amp; Infrastructure</w:t>
+      </w:r>
+    </w:p>
+    <w:p>
+      <w:r>
+        <w:t>Hosting: Vercel (Next.js optimized hosting with edge functions)</w:t>
+        <w:br/>
+        <w:t>Database: Supabase (managed PostgreSQL)</w:t>
+        <w:br/>
+        <w:t>Domain: carecompanionai.org</w:t>
+        <w:br/>
+        <w:t>CI/CD: GitHub push → Vercel auto-deploy (+ pre-push build hook locally)</w:t>
+        <w:br/>
+        <w:t>Cron Jobs: Vercel cron for daily sync, notifications, and reminders</w:t>
+        <w:br/>
+        <w:t>PWA: Web manifest for mobile installability (standalone display, dark theme)</w:t>
+        <w:br/>
+        <w:t>SEO: OpenGraph tags, Twitter cards, JSON-LD structured data, dynamic sitemap, robots.txt</w:t>
+        <w:br/>
+        <w:t>Analytics: Event tracking utility (ready for PostHog integration)</w:t>
+        <w:br/>
+        <w:t>Error Monitoring: Error reporting utility (ready for Sentry integration)</w:t>
+        <w:br/>
+        <w:t>Rate Limiting: In-memory token bucket per IP/user</w:t>
+      </w:r>
+    </w:p>
+    <w:p>
+      <w:pPr>
+        <w:pStyle w:val="Heading1"/>
+      </w:pPr>
+      <w:r>
+        <w:t>15. Testing</w:t>
+      </w:r>
+    </w:p>
+    <w:p>
+      <w:r>
+        <w:t>Unit Tests: Vitest — covers extraction, FHIR parsing, conflict detection, cron jobs, tools</w:t>
+        <w:br/>
+        <w:t>E2E Tests: Playwright — browser-based integration testing</w:t>
+        <w:br/>
+        <w:t>Linting: ESLint with Next.js config, lint-staged on pre-commit</w:t>
+        <w:br/>
+        <w:t>Type Checking: TypeScript strict mode, checked on pre-push</w:t>
+        <w:br/>
+        <w:t>Build Verification: Pre-push hook runs typecheck + full build before allowing push</w:t>
+        <w:br/>
+        <w:t>Total: 66+ test cases across extraction, FHIR, conflicts, cron, and tools</w:t>
+      </w:r>
+    </w:p>
+    <w:p>
+      <w:pPr>
+        <w:pStyle w:val="Heading1"/>
+      </w:pPr>
+      <w:r>
+        <w:t>16. Future Roadmap</w:t>
+      </w:r>
+    </w:p>
+    <w:p>
+      <w:pPr>
+        <w:pStyle w:val="Heading2"/>
+      </w:pPr>
+      <w:r>
+        <w:t>Phase 1: Chat-First Launch (Current)</w:t>
       </w:r>
     </w:p>
     <w:p>
@@ -1897,13 +2736,7 @@
         <w:pStyle w:val="ListBullet"/>
       </w:pPr>
       <w:r>
-        <w:rPr>
-          <w:b/>
-        </w:rPr>
-        <w:t xml:space="preserve">Walgreens pharmacy integration — </w:t>
-      </w:r>
-      <w:r>
-        <w:t>Automatic refill syncing with the pharmacy</w:t>
+        <w:t>Enable anonymous/guest chat without signup</w:t>
       </w:r>
     </w:p>
     <w:p>
@@ -1911,13 +2744,7 @@
         <w:pStyle w:val="ListBullet"/>
       </w:pPr>
       <w:r>
-        <w:rPr>
-          <w:b/>
-        </w:rPr>
-        <w:t xml:space="preserve">Automatic health system sync on a schedule — </w:t>
-      </w:r>
-      <w:r>
-        <w:t>Currently requires a manual trigger; scheduled auto-sync is planned</w:t>
+        <w:t>Restructure landing page so primary CTA opens chat</w:t>
       </w:r>
     </w:p>
     <w:p>
@@ -1925,19 +2752,127 @@
         <w:pStyle w:val="ListBullet"/>
       </w:pPr>
       <w:r>
-        <w:rPr>
-          <w:b/>
-        </w:rPr>
-        <w:t xml:space="preserve">Google Calendar two-way sync — </w:t>
-      </w:r>
-      <w:r>
-        <w:t>The routes exist but aren't fully wired up</w:t>
+        <w:t>Add conversion prompt after 5 messages</w:t>
       </w:r>
     </w:p>
-    <w:p/>
     <w:p>
+      <w:pPr>
+        <w:pStyle w:val="ListBullet"/>
+      </w:pPr>
       <w:r>
-        <w:t>That's the complete picture of CareCompanion — from the AI architecture to every screen the user sees to every table in the database. It's a caregiving command center that combines AI conversation, health data aggregation, proactive alerts, and family collaboration into one app.</w:t>
+        <w:t>Launch on cancer caregiver forums and Reddit</w:t>
+      </w:r>
+    </w:p>
+    <w:p>
+      <w:pPr>
+        <w:pStyle w:val="Heading2"/>
+      </w:pPr>
+      <w:r>
+        <w:t>Phase 2: Health Data Integration</w:t>
+      </w:r>
+    </w:p>
+    <w:p>
+      <w:pPr>
+        <w:pStyle w:val="ListBullet"/>
+      </w:pPr>
+      <w:r>
+        <w:t>Complete Epic FHIR production approval</w:t>
+      </w:r>
+    </w:p>
+    <w:p>
+      <w:pPr>
+        <w:pStyle w:val="ListBullet"/>
+      </w:pPr>
+      <w:r>
+        <w:t>Activate 1upHealth aggregator (500+ health systems)</w:t>
+      </w:r>
+    </w:p>
+    <w:p>
+      <w:pPr>
+        <w:pStyle w:val="ListBullet"/>
+      </w:pPr>
+      <w:r>
+        <w:t>Medicare Blue Button registration</w:t>
+      </w:r>
+    </w:p>
+    <w:p>
+      <w:pPr>
+        <w:pStyle w:val="ListBullet"/>
+      </w:pPr>
+      <w:r>
+        <w:t>Walgreens prescription sync partnership</w:t>
+      </w:r>
+    </w:p>
+    <w:p>
+      <w:pPr>
+        <w:pStyle w:val="ListBullet"/>
+      </w:pPr>
+      <w:r>
+        <w:t>HIPAA-eligible Supabase tier + BAA</w:t>
+      </w:r>
+    </w:p>
+    <w:p>
+      <w:pPr>
+        <w:pStyle w:val="Heading2"/>
+      </w:pPr>
+      <w:r>
+        <w:t>Phase 3: Cancer Concierge (12-month vision)</w:t>
+      </w:r>
+    </w:p>
+    <w:p>
+      <w:pPr>
+        <w:pStyle w:val="ListBullet"/>
+      </w:pPr>
+      <w:r>
+        <w:t>Proactive AI care management ("Your ANC is low, avoid crowds this week")</w:t>
+      </w:r>
+    </w:p>
+    <w:p>
+      <w:pPr>
+        <w:pStyle w:val="ListBullet"/>
+      </w:pPr>
+      <w:r>
+        <w:t>Push notifications for medication reminders</w:t>
+      </w:r>
+    </w:p>
+    <w:p>
+      <w:pPr>
+        <w:pStyle w:val="ListBullet"/>
+      </w:pPr>
+      <w:r>
+        <w:t>Caregiver daily digest email</w:t>
+      </w:r>
+    </w:p>
+    <w:p>
+      <w:pPr>
+        <w:pStyle w:val="ListBullet"/>
+      </w:pPr>
+      <w:r>
+        <w:t>Symptom trend charts and predictive analytics</w:t>
+      </w:r>
+    </w:p>
+    <w:p>
+      <w:pPr>
+        <w:pStyle w:val="ListBullet"/>
+      </w:pPr>
+      <w:r>
+        <w:t>Treatment cost tracker</w:t>
+      </w:r>
+    </w:p>
+    <w:p>
+      <w:pPr>
+        <w:pStyle w:val="ListBullet"/>
+      </w:pPr>
+      <w:r>
+        <w:t>Apple Sign-In</w:t>
+      </w:r>
+    </w:p>
+    <w:p>
+      <w:pPr>
+        <w:pStyle w:val="ListBullet"/>
+      </w:pPr>
+      <w:r>
+        <w:t>Wearable integrations (Fitbit, Oura, Withings)</w:t>
       </w:r>
     </w:p>
     <w:sectPr>
@@ -2667,7 +3602,7 @@
     </w:pPr>
     <w:rPr>
       <w:rFonts w:asciiTheme="majorHAnsi" w:eastAsiaTheme="majorEastAsia" w:hAnsiTheme="majorHAnsi" w:cstheme="majorBidi"/>
-      <w:color w:val="17365D" w:themeColor="text2" w:themeShade="BF"/>
+      <w:color w:val="6366F1"/>
       <w:spacing w:val="5"/>
       <w:kern w:val="28"/>
       <w:sz w:val="52"/>

</xml_diff>